<commit_message>
Fix duplicate formulas in docx
</commit_message>
<xml_diff>
--- a/Методичка_ТАУ.docx
+++ b/Методичка_ТАУ.docx
@@ -2225,6 +2225,1048 @@
         </w:rPr>
         <w:tab/>
         <w:t>(51)</w:t>
+      </w:r>
+    </w:p>
+    <w:p>
+      <w:pPr/>
+      <w:r>
+        <w:t>Вид переходного процесса зависит от коэффициента демпфирования: * При $\xi &lt; 1$ корни характеристического уравнения комплексно-сопряженные. Переходный процесс носит затухающий колебательный характер (перерегулирование). * При $\xi \ge 1$ процесс теряет колебательность и становится апериодическим (звено разбивается на два апериодических звена 1-го порядка). В энергетике для надежной работы АРВ стремятся настроить параметры системы так, чтобы обеспечить хорошее демпфирование ($\xi \approx 0,7 \div 0,9$) и предотвратить раскачивание параметров сети.</w:t>
+      </w:r>
+    </w:p>
+    <w:p>
+      <w:pPr>
+        <w:pStyle w:val="Heading1"/>
+      </w:pPr>
+      <w:r>
+        <w:t>Лекция 2. Математическое описание линейных непрерывных систем. Дифференциальные уравнения и передаточные функции</w:t>
+      </w:r>
+    </w:p>
+    <w:p>
+      <w:pPr/>
+      <w:r>
+        <w:t>Любая автоматическая система состоит из взаимосвязанных динамических звеньев. Для того чтобы проанализировать работу системы автоматического управления (САУ) в переходных и установившихся режимах, необходимо иметь ее адекватную математическую модель.</w:t>
+      </w:r>
+    </w:p>
+    <w:p>
+      <w:pPr/>
+      <w:r>
+        <w:t>В классической теории автоматического управления (ТАУ) динамика линейных непрерывных систем описывается обыкновенными линейными дифференциальными уравнениями с постоянными коэффициентами.</w:t>
+      </w:r>
+    </w:p>
+    <w:p>
+      <w:pPr>
+        <w:pStyle w:val="Heading2"/>
+      </w:pPr>
+      <w:r>
+        <w:t>1. Дифференциальные уравнения динамических систем</w:t>
+      </w:r>
+    </w:p>
+    <w:p>
+      <w:pPr/>
+      <w:r>
+        <w:t>Пусть $u(t)$ — входное воздействие на систему (или отдельное звено), а $y(t)$ — выходная координата (реакция системы). В общем случае связь между ними описывается линейным дифференциальным уравнением $n$-го порядка:</w:t>
+      </w:r>
+    </w:p>
+    <w:p>
+      <w:pPr>
+        <w:spacing w:before="120" w:after="120"/>
+        <w:jc w:val="center"/>
+      </w:pPr>
+      <w:r>
+        <w:rPr>
+          <w:rFonts w:ascii="Times New Roman" w:hAnsi="Times New Roman"/>
+          <w:i/>
+          <w:sz w:val="28"/>
+        </w:rPr>
+        <w:t>a_n (d^n y(t)) / (dt^n) + a_(n-1) frac{d^(n-1) y(t)}{dt^(n-1)} + ... + a_0 y(t) = b_m (d^m u(t)) / (dt^m) + ... + b_0 u(t)</w:t>
+      </w:r>
+      <w:r>
+        <w:rPr>
+          <w:rFonts w:ascii="Times New Roman" w:hAnsi="Times New Roman"/>
+          <w:sz w:val="28"/>
+        </w:rPr>
+        <w:tab/>
+        <w:t>(52)</w:t>
+      </w:r>
+    </w:p>
+    <w:p>
+      <w:pPr/>
+      <w:r>
+        <w:t>где $a_i$ и $b_j$ — постоянные коэффициенты, определяемые физическими (конструктивными) параметрами системы (массами, индуктивностями, емкостями, сопротивлениями и т.д.). Для физически реализуемых макроскопических систем всегда выполняется условие $n \ge m$, что отражает свойство инерционности реальных объектов: выходная координата не может изменяться мгновенно при бесконечно быстром изменении входного сигнала.</w:t>
+      </w:r>
+    </w:p>
+    <w:p>
+      <w:pPr>
+        <w:spacing w:before="120" w:after="120"/>
+        <w:jc w:val="center"/>
+      </w:pPr>
+      <w:r>
+        <w:rPr>
+          <w:rFonts w:ascii="Times New Roman" w:hAnsi="Times New Roman"/>
+          <w:i/>
+          <w:sz w:val="28"/>
+        </w:rPr>
+        <w:t>Для удобства анализа дифференциальное уравнение часто записывают в операторной форме, используя символ дифференцирования $p = (d) / (dt)$:</w:t>
+      </w:r>
+      <w:r>
+        <w:rPr>
+          <w:rFonts w:ascii="Times New Roman" w:hAnsi="Times New Roman"/>
+          <w:sz w:val="28"/>
+        </w:rPr>
+        <w:tab/>
+        <w:t>(53)</w:t>
+      </w:r>
+    </w:p>
+    <w:p>
+      <w:pPr>
+        <w:spacing w:before="120" w:after="120"/>
+        <w:jc w:val="center"/>
+      </w:pPr>
+      <w:r>
+        <w:rPr>
+          <w:rFonts w:ascii="Times New Roman" w:hAnsi="Times New Roman"/>
+          <w:i/>
+          <w:sz w:val="28"/>
+        </w:rPr>
+        <w:t>(a_n p^n + a_(n-1) p^(n-1) + ... + a_0) y(t) = (b_m p^m + ... + b_0) u(t)</w:t>
+      </w:r>
+      <w:r>
+        <w:rPr>
+          <w:rFonts w:ascii="Times New Roman" w:hAnsi="Times New Roman"/>
+          <w:sz w:val="28"/>
+        </w:rPr>
+        <w:tab/>
+        <w:t>(54)</w:t>
+      </w:r>
+    </w:p>
+    <w:p>
+      <w:pPr>
+        <w:pStyle w:val="Heading2"/>
+      </w:pPr>
+      <w:r>
+        <w:t>2. Преобразование Лапласа и передаточная функция</w:t>
+      </w:r>
+    </w:p>
+    <w:p>
+      <w:pPr>
+        <w:spacing w:before="120" w:after="120"/>
+        <w:jc w:val="center"/>
+      </w:pPr>
+      <w:r>
+        <w:rPr>
+          <w:rFonts w:ascii="Times New Roman" w:hAnsi="Times New Roman"/>
+          <w:i/>
+          <w:sz w:val="28"/>
+        </w:rPr>
+        <w:t>Непосредственное решение дифференциальных уравнений высоких порядков для сложной многоконтурной системы — крайне трудоемкая задача. Метод, который радикально упрощает анализ, основан на преобразовании Лапласа. Это интегральное преобразование переводит функции вещественного переменного (времени $t$) в функции комплексного переменного $s = α + jω$.</w:t>
+      </w:r>
+      <w:r>
+        <w:rPr>
+          <w:rFonts w:ascii="Times New Roman" w:hAnsi="Times New Roman"/>
+          <w:sz w:val="28"/>
+        </w:rPr>
+        <w:tab/>
+        <w:t>(55)</w:t>
+      </w:r>
+    </w:p>
+    <w:p>
+      <w:pPr/>
+      <w:r>
+        <w:t>Прямое преобразование Лапласа для функции времени $f(t)$ определяется интегралом:</w:t>
+      </w:r>
+    </w:p>
+    <w:p>
+      <w:pPr>
+        <w:spacing w:before="120" w:after="120"/>
+        <w:jc w:val="center"/>
+      </w:pPr>
+      <w:r>
+        <w:rPr>
+          <w:rFonts w:ascii="Times New Roman" w:hAnsi="Times New Roman"/>
+          <w:i/>
+          <w:sz w:val="28"/>
+        </w:rPr>
+        <w:t>F(s) = int_0^(infty) f(t) e^(-st) dt</w:t>
+      </w:r>
+      <w:r>
+        <w:rPr>
+          <w:rFonts w:ascii="Times New Roman" w:hAnsi="Times New Roman"/>
+          <w:sz w:val="28"/>
+        </w:rPr>
+        <w:tab/>
+        <w:t>(56)</w:t>
+      </w:r>
+    </w:p>
+    <w:p>
+      <w:pPr/>
+      <w:r>
+        <w:t>Главное свойство преобразования Лапласа заключается в том, что операция дифференцирования оригинала во временной области заменяется алгебраической операцией умножения изображения на комплексную переменную $s$ (при нулевых начальных условиях):</w:t>
+      </w:r>
+    </w:p>
+    <w:p>
+      <w:pPr>
+        <w:spacing w:before="120" w:after="120"/>
+        <w:jc w:val="center"/>
+      </w:pPr>
+      <w:r>
+        <w:rPr>
+          <w:rFonts w:ascii="Times New Roman" w:hAnsi="Times New Roman"/>
+          <w:i/>
+          <w:sz w:val="28"/>
+        </w:rPr>
+        <w:t>L left\{ (df(t)) / (dt) right\} = s F(s)</w:t>
+      </w:r>
+      <w:r>
+        <w:rPr>
+          <w:rFonts w:ascii="Times New Roman" w:hAnsi="Times New Roman"/>
+          <w:sz w:val="28"/>
+        </w:rPr>
+        <w:tab/>
+        <w:t>(57)</w:t>
+      </w:r>
+    </w:p>
+    <w:p>
+      <w:pPr/>
+      <w:r>
+        <w:t>Применяя преобразование Лапласа к дифференциальному уравнению звена при нулевых начальных условиях (когда до момента $t=0$ система находилась в покое), мы переходим от дифференциального уравнения к алгебраическому:</w:t>
+      </w:r>
+    </w:p>
+    <w:p>
+      <w:pPr>
+        <w:spacing w:before="120" w:after="120"/>
+        <w:jc w:val="center"/>
+      </w:pPr>
+      <w:r>
+        <w:rPr>
+          <w:rFonts w:ascii="Times New Roman" w:hAnsi="Times New Roman"/>
+          <w:i/>
+          <w:sz w:val="28"/>
+        </w:rPr>
+        <w:t>(a_n s^n + a_(n-1) s^(n-1) + ... + a_0) Y(s) = (b_m s^m + ... + b_0) U(s)</w:t>
+      </w:r>
+      <w:r>
+        <w:rPr>
+          <w:rFonts w:ascii="Times New Roman" w:hAnsi="Times New Roman"/>
+          <w:sz w:val="28"/>
+        </w:rPr>
+        <w:tab/>
+        <w:t>(58)</w:t>
+      </w:r>
+    </w:p>
+    <w:p>
+      <w:pPr/>
+      <w:r>
+        <w:t>Здесь $Y(s)$ и $U(s)$ — изображения Лапласа выходного и входного сигналов соответственно. Выразим отношение изображения выходной величины к изображению входной:</w:t>
+      </w:r>
+    </w:p>
+    <w:p>
+      <w:pPr>
+        <w:spacing w:before="120" w:after="120"/>
+        <w:jc w:val="center"/>
+      </w:pPr>
+      <w:r>
+        <w:rPr>
+          <w:rFonts w:ascii="Times New Roman" w:hAnsi="Times New Roman"/>
+          <w:i/>
+          <w:sz w:val="28"/>
+        </w:rPr>
+        <w:t>W(s) = (Y(s)) / (U(s)) = (b_m s^m + ... + b_0) / (a_n s^n + a_(n-1) s^(n-1) + ... + a_0)</w:t>
+      </w:r>
+      <w:r>
+        <w:rPr>
+          <w:rFonts w:ascii="Times New Roman" w:hAnsi="Times New Roman"/>
+          <w:sz w:val="28"/>
+        </w:rPr>
+        <w:tab/>
+        <w:t>(59)</w:t>
+      </w:r>
+    </w:p>
+    <w:p>
+      <w:pPr/>
+      <w:r>
+        <w:t>Эта дробно-рациональная функция $W(s)$ называется **передаточной функцией** звена (или системы). Передаточная функция является исчерпывающей математической характеристикой динамических свойств линейной системы при нулевых начальных условиях. Она зависит только от внутренних параметров системы (коэффициентов $a_i$, $b_j$) и не зависит от вида входного воздействия.</w:t>
+      </w:r>
+    </w:p>
+    <w:p>
+      <w:pPr/>
+      <w:r>
+        <w:t>Многочлен в знаменателе $D(s) = a_n s^n + ... + a_0$ называется характеристическим полиномом. Уравнение $D(s) = 0$ — это характеристическое уравнение системы. Корни этого уравнения называются **полюсами** передаточной функции. Многочлен в числителе $M(s) = b_m s^m + ... + b_0$ определяет **нули** передаточной функции. Полюса и нули полностью определяют характер переходных процессов в САУ.</w:t>
+      </w:r>
+    </w:p>
+    <w:p>
+      <w:pPr>
+        <w:pStyle w:val="Heading2"/>
+      </w:pPr>
+      <w:r>
+        <w:t>3. Структурные схемы систем автоматического управления</w:t>
+      </w:r>
+    </w:p>
+    <w:p>
+      <w:pPr/>
+      <w:r>
+        <w:t>Реальные электроэнергетические системы (например, система возбуждения синхронного генератора) состоят из множества элементов: измерительных трансформаторов, выпрямителей, усилителей, магнитных пускателей и т.д. В ТАУ для визуализации математических моделей используются структурные схемы.</w:t>
+      </w:r>
+    </w:p>
+    <w:p>
+      <w:pPr/>
+      <w:r>
+        <w:t>Структурная схема — это графическое изображение математической модели системы, в котором каждому элементу ставится в соответствие прямоугольник с вписанной в него передаточной функцией $W_i(s)$. Линии со стрелками показывают направление прохождения сигналов. Для алгебраического сложения сигналов используются сумматоры (кружки с разделенными секторами).</w:t>
+      </w:r>
+    </w:p>
+    <w:p>
+      <w:pPr/>
+      <w:r>
+        <w:t>Существуют три базовых типа соединения звеньев в структурных схемах:</w:t>
+      </w:r>
+    </w:p>
+    <w:p>
+      <w:pPr>
+        <w:pStyle w:val="Heading3"/>
+      </w:pPr>
+      <w:r>
+        <w:t>3,1. Последовательное соединение</w:t>
+      </w:r>
+    </w:p>
+    <w:p>
+      <w:pPr/>
+      <w:r>
+        <w:t>Выходной сигнал предыдущего звена является входным сигналом для последующего. Передаточная функция эквивалентного звена равна произведению передаточных функций последовательно соединенных звеньев:</w:t>
+      </w:r>
+    </w:p>
+    <w:p>
+      <w:pPr>
+        <w:spacing w:before="120" w:after="120"/>
+        <w:jc w:val="center"/>
+      </w:pPr>
+      <w:r>
+        <w:rPr>
+          <w:rFonts w:ascii="Times New Roman" w:hAnsi="Times New Roman"/>
+          <w:i/>
+          <w:sz w:val="28"/>
+        </w:rPr>
+        <w:t>W_(экв)(s) = W_1(s) · W_2(s) · ... · W_k(s) = prod_(i=1)^k W_i(s)</w:t>
+      </w:r>
+      <w:r>
+        <w:rPr>
+          <w:rFonts w:ascii="Times New Roman" w:hAnsi="Times New Roman"/>
+          <w:sz w:val="28"/>
+        </w:rPr>
+        <w:tab/>
+        <w:t>(60)</w:t>
+      </w:r>
+    </w:p>
+    <w:p>
+      <w:pPr>
+        <w:pStyle w:val="Heading3"/>
+      </w:pPr>
+      <w:r>
+        <w:t>3,2. Параллельное (согласное) соединение</w:t>
+      </w:r>
+    </w:p>
+    <w:p>
+      <w:pPr/>
+      <w:r>
+        <w:t>Один и тот же входной сигнал подается на входы нескольких звеньев, а их выходные сигналы алгебраически суммируются. Эквивалентная передаточная функция равна сумме передаточных функций этих звеньев:</w:t>
+      </w:r>
+    </w:p>
+    <w:p>
+      <w:pPr>
+        <w:spacing w:before="120" w:after="120"/>
+        <w:jc w:val="center"/>
+      </w:pPr>
+      <w:r>
+        <w:rPr>
+          <w:rFonts w:ascii="Times New Roman" w:hAnsi="Times New Roman"/>
+          <w:i/>
+          <w:sz w:val="28"/>
+        </w:rPr>
+        <w:t>W_(экв)(s) = W_1(s) + W_2(s) + ... + W_k(s) = sum_(i=1)^k W_i(s)</w:t>
+      </w:r>
+      <w:r>
+        <w:rPr>
+          <w:rFonts w:ascii="Times New Roman" w:hAnsi="Times New Roman"/>
+          <w:sz w:val="28"/>
+        </w:rPr>
+        <w:tab/>
+        <w:t>(61)</w:t>
+      </w:r>
+    </w:p>
+    <w:p>
+      <w:pPr>
+        <w:pStyle w:val="Heading3"/>
+      </w:pPr>
+      <w:r>
+        <w:t>3,3. Соединение с обратной связью (встречно-параллельное)</w:t>
+      </w:r>
+    </w:p>
+    <w:p>
+      <w:pPr/>
+      <w:r>
+        <w:t>Это фундаментальное соединение для построения замкнутых САУ. Выходной сигнал основного звена $W_1(s)$ через звено обратной связи $W_2(s)$ подается обратно на вход сумматора. * Если сигнал обратной связи вычитается из задающего воздействия, связь называется **отрицательной**. Это основа для построения устойчивых регуляторов (стабилизирующих систем). * Если сигнал прибавляется — связь называется **положительной**.</w:t>
+      </w:r>
+    </w:p>
+    <w:p>
+      <w:pPr/>
+      <w:r>
+        <w:t>Эквивалентная передаточная функция замкнутого контура определяется выражением (знак "+" в знаменателе соответствует отрицательной обратной связи, знак "-" — положительной):</w:t>
+      </w:r>
+    </w:p>
+    <w:p>
+      <w:pPr>
+        <w:spacing w:before="120" w:after="120"/>
+        <w:jc w:val="center"/>
+      </w:pPr>
+      <w:r>
+        <w:rPr>
+          <w:rFonts w:ascii="Times New Roman" w:hAnsi="Times New Roman"/>
+          <w:i/>
+          <w:sz w:val="28"/>
+        </w:rPr>
+        <w:t>W_(экв)(s) = (W_1(s)) / (1 ± W_1(s) W_2(s))</w:t>
+      </w:r>
+      <w:r>
+        <w:rPr>
+          <w:rFonts w:ascii="Times New Roman" w:hAnsi="Times New Roman"/>
+          <w:sz w:val="28"/>
+        </w:rPr>
+        <w:tab/>
+        <w:t>(62)</w:t>
+      </w:r>
+    </w:p>
+    <w:p>
+      <w:pPr/>
+      <w:r>
+        <w:t>Уравнения структурных преобразований позволяют сводить сколь угодно сложные многоконтурные схемы энергосистем к одному эквивалентному звену с единой передаточной функцией. Это является первым и важнейшим этапом перед применением критериев устойчивости (Рауса, Гурвица, Найквиста), которые мы рассмотрим в последующих лекциях.</w:t>
+      </w:r>
+    </w:p>
+    <w:p>
+      <w:pPr>
+        <w:pStyle w:val="Heading1"/>
+      </w:pPr>
+      <w:r>
+        <w:t>Лекция 3. Временные характеристики типовых динамических звеньев и систем автоматического управления</w:t>
+      </w:r>
+    </w:p>
+    <w:p>
+      <w:pPr/>
+      <w:r>
+        <w:t>Поведение элементов электроэнергетической системы во времени является важнейшим фактором, определяющим надежность энергоснабжения. Для оценки динамических свойств звеньев систем автоматического управления (САУ) в классической теории применяются стандартные типовые воздействия. Реакция звена на такие воздействия называется его временной характеристикой.</w:t>
+      </w:r>
+    </w:p>
+    <w:p>
+      <w:pPr>
+        <w:pStyle w:val="Heading2"/>
+      </w:pPr>
+      <w:r>
+        <w:t>1. Типовые тестовые воздействия</w:t>
+      </w:r>
+    </w:p>
+    <w:p>
+      <w:pPr/>
+      <w:r>
+        <w:t>Для математического анализа динамики звеньев чаще всего используют два типовых входных сигнала:</w:t>
+      </w:r>
+    </w:p>
+    <w:p>
+      <w:pPr>
+        <w:pStyle w:val="Heading3"/>
+      </w:pPr>
+      <w:r>
+        <w:t>1,1. Единичная ступенчатая функция (функция Хевисайда)</w:t>
+      </w:r>
+    </w:p>
+    <w:p>
+      <w:pPr/>
+      <w:r>
+        <w:t>Этот сигнал имитирует мгновенное (скачкообразное) изменение входной величины, например, мгновенный сброс или наброс нагрузки генератора, короткое замыкание или включение рубильника. Обозначается $1(t)$ и математически определяется как:</w:t>
+      </w:r>
+    </w:p>
+    <w:p>
+      <w:pPr/>
+      <w:r>
+        <w:t>1(t) = \begin{cases} 0, &amp; t &lt; 0 \\ 1, &amp; t \ge 0 \end{cases}</w:t>
+      </w:r>
+    </w:p>
+    <w:p>
+      <w:pPr/>
+      <w:r>
+        <w:t>Изображение по Лапласу для единичной ступенчатой функции:</w:t>
+      </w:r>
+    </w:p>
+    <w:p>
+      <w:pPr>
+        <w:spacing w:before="120" w:after="120"/>
+        <w:jc w:val="center"/>
+      </w:pPr>
+      <w:r>
+        <w:rPr>
+          <w:rFonts w:ascii="Times New Roman" w:hAnsi="Times New Roman"/>
+          <w:i/>
+          <w:sz w:val="28"/>
+        </w:rPr>
+        <w:t>U(s) = (1) / (s)</w:t>
+      </w:r>
+      <w:r>
+        <w:rPr>
+          <w:rFonts w:ascii="Times New Roman" w:hAnsi="Times New Roman"/>
+          <w:sz w:val="28"/>
+        </w:rPr>
+        <w:tab/>
+        <w:t>(63)</w:t>
+      </w:r>
+    </w:p>
+    <w:p>
+      <w:pPr/>
+      <w:r>
+        <w:t>Реакция системы при нулевых начальных условиях на единичное ступенчатое воздействие называется **переходной характеристикой (функцией)** и обозначается $h(t)$.</w:t>
+      </w:r>
+    </w:p>
+    <w:p>
+      <w:pPr>
+        <w:pStyle w:val="Heading3"/>
+      </w:pPr>
+      <w:r>
+        <w:t>1,2. Единичная импульсная функция (дельта-функция Дирака)</w:t>
+      </w:r>
+    </w:p>
+    <w:p>
+      <w:pPr/>
+      <w:r>
+        <w:t>Имитирует мгновенный удар бесконечной амплитуды, но с единичной площадью (единичным интегралом). Это может быть, например, удар молнии в линию электропередачи. Обозначается $\delta(t)$ и обладает следующими свойствами:</w:t>
+      </w:r>
+    </w:p>
+    <w:p>
+      <w:pPr>
+        <w:spacing w:before="120" w:after="120"/>
+        <w:jc w:val="center"/>
+      </w:pPr>
+      <w:r>
+        <w:rPr>
+          <w:rFonts w:ascii="Times New Roman" w:hAnsi="Times New Roman"/>
+          <w:i/>
+          <w:sz w:val="28"/>
+        </w:rPr>
+        <w:t>δ(t) = 0 при t ≠ 0, int_(-infty)^(infty) δ(t) dt = 1</w:t>
+      </w:r>
+      <w:r>
+        <w:rPr>
+          <w:rFonts w:ascii="Times New Roman" w:hAnsi="Times New Roman"/>
+          <w:sz w:val="28"/>
+        </w:rPr>
+        <w:tab/>
+        <w:t>(64)</w:t>
+      </w:r>
+    </w:p>
+    <w:p>
+      <w:pPr/>
+      <w:r>
+        <w:t>Изображение по Лапласу для дельта-функции равно единице: $U(s) = 1$. Реакция системы при нулевых начальных условиях на дельта-функцию называется **весовой (или импульсной переходной) функцией** и обозначается $w(t)$.</w:t>
+      </w:r>
+    </w:p>
+    <w:p>
+      <w:pPr/>
+      <w:r>
+        <w:t>Поскольку дельта-функция является производной от функции Хевисайда, весовая функция является производной по времени от переходной функции:</w:t>
+      </w:r>
+    </w:p>
+    <w:p>
+      <w:pPr>
+        <w:spacing w:before="120" w:after="120"/>
+        <w:jc w:val="center"/>
+      </w:pPr>
+      <w:r>
+        <w:rPr>
+          <w:rFonts w:ascii="Times New Roman" w:hAnsi="Times New Roman"/>
+          <w:i/>
+          <w:sz w:val="28"/>
+        </w:rPr>
+        <w:t>w(t) = (dh(t)) / (dt)</w:t>
+      </w:r>
+      <w:r>
+        <w:rPr>
+          <w:rFonts w:ascii="Times New Roman" w:hAnsi="Times New Roman"/>
+          <w:sz w:val="28"/>
+        </w:rPr>
+        <w:tab/>
+        <w:t>(65)</w:t>
+      </w:r>
+    </w:p>
+    <w:p>
+      <w:pPr/>
+      <w:r>
+        <w:t>Связь временных характеристик с передаточной функцией $W(s)$: W(s) = L \{w(t)\} = s L \{h(t)\}</w:t>
+      </w:r>
+    </w:p>
+    <w:p>
+      <w:pPr/>
+      <w:r>
+        <w:t>W(s) = L \{w(t)\} = s L \{h(t)\}</w:t>
+      </w:r>
+    </w:p>
+    <w:p>
+      <w:pPr>
+        <w:pStyle w:val="Heading2"/>
+      </w:pPr>
+      <w:r>
+        <w:t>2. Типовые динамические звенья САУ</w:t>
+      </w:r>
+    </w:p>
+    <w:p>
+      <w:pPr/>
+      <w:r>
+        <w:t>Сложные системы могут быть разбиты на простейшие элементы, описываемые дифференциальными уравнениями не выше второго порядка. Такие элементы называют типовыми динамическими звеньями.</w:t>
+      </w:r>
+    </w:p>
+    <w:p>
+      <w:pPr>
+        <w:pStyle w:val="Heading3"/>
+      </w:pPr>
+      <w:r>
+        <w:t>2,1. Безынерционное (усилительное, пропорциональное) звено</w:t>
+      </w:r>
+    </w:p>
+    <w:p>
+      <w:pPr/>
+      <w:r>
+        <w:t>Звено, в котором выходная величина в любой момент времени строго пропорциональна входной величине. В нем отсутствуют элементы, накапливающие энергию (массы, индуктивности, емкости). В энергетике примером служит идеальный трансформатор напряжения или рычажная передача.</w:t>
+      </w:r>
+    </w:p>
+    <w:p>
+      <w:pPr/>
+      <w:r>
+        <w:t>Уравнение звена:</w:t>
+      </w:r>
+    </w:p>
+    <w:p>
+      <w:pPr>
+        <w:spacing w:before="120" w:after="120"/>
+        <w:jc w:val="center"/>
+      </w:pPr>
+      <w:r>
+        <w:rPr>
+          <w:rFonts w:ascii="Times New Roman" w:hAnsi="Times New Roman"/>
+          <w:i/>
+          <w:sz w:val="28"/>
+        </w:rPr>
+        <w:t>y(t) = k · u(t)</w:t>
+      </w:r>
+      <w:r>
+        <w:rPr>
+          <w:rFonts w:ascii="Times New Roman" w:hAnsi="Times New Roman"/>
+          <w:sz w:val="28"/>
+        </w:rPr>
+        <w:tab/>
+        <w:t>(66)</w:t>
+      </w:r>
+    </w:p>
+    <w:p>
+      <w:pPr/>
+      <w:r>
+        <w:t>где $k$ — коэффициент усиления (передачи).</w:t>
+      </w:r>
+    </w:p>
+    <w:p>
+      <w:pPr/>
+      <w:r>
+        <w:t>Передаточная функция: W(s) = k</w:t>
+      </w:r>
+    </w:p>
+    <w:p>
+      <w:pPr/>
+      <w:r>
+        <w:t>W(s) = k</w:t>
+      </w:r>
+    </w:p>
+    <w:p>
+      <w:pPr>
+        <w:spacing w:before="120" w:after="120"/>
+        <w:jc w:val="center"/>
+      </w:pPr>
+      <w:r>
+        <w:rPr>
+          <w:rFonts w:ascii="Times New Roman" w:hAnsi="Times New Roman"/>
+          <w:i/>
+          <w:sz w:val="28"/>
+        </w:rPr>
+        <w:t>Переходная функция представляет собой масштабированную ступенчатую функцию: $h(t) = k · 1(t)$.</w:t>
+      </w:r>
+      <w:r>
+        <w:rPr>
+          <w:rFonts w:ascii="Times New Roman" w:hAnsi="Times New Roman"/>
+          <w:sz w:val="28"/>
+        </w:rPr>
+        <w:tab/>
+        <w:t>(67)</w:t>
+      </w:r>
+    </w:p>
+    <w:p>
+      <w:pPr>
+        <w:pStyle w:val="Heading3"/>
+      </w:pPr>
+      <w:r>
+        <w:t>2,2. Интегрирующее звено</w:t>
+      </w:r>
+    </w:p>
+    <w:p>
+      <w:pPr/>
+      <w:r>
+        <w:t>В этом звене скорость изменения выходной величины пропорциональна входному сигналу. Это означает, что звено накапливает воздействие. Примером может служить электродвигатель постоянного тока (если вход — напряжение якоря, а выход — угол поворота вала) или резервуар с водой.</w:t>
+      </w:r>
+    </w:p>
+    <w:p>
+      <w:pPr/>
+      <w:r>
+        <w:t>Уравнение звена:</w:t>
+      </w:r>
+    </w:p>
+    <w:p>
+      <w:pPr>
+        <w:spacing w:before="120" w:after="120"/>
+        <w:jc w:val="center"/>
+      </w:pPr>
+      <w:r>
+        <w:rPr>
+          <w:rFonts w:ascii="Times New Roman" w:hAnsi="Times New Roman"/>
+          <w:i/>
+          <w:sz w:val="28"/>
+        </w:rPr>
+        <w:t>(dy(t)) / (dt) = k · u(t) implies y(t) = k int u(t) dt</w:t>
+      </w:r>
+      <w:r>
+        <w:rPr>
+          <w:rFonts w:ascii="Times New Roman" w:hAnsi="Times New Roman"/>
+          <w:sz w:val="28"/>
+        </w:rPr>
+        <w:tab/>
+        <w:t>(68)</w:t>
+      </w:r>
+    </w:p>
+    <w:p>
+      <w:pPr/>
+      <w:r>
+        <w:t>Передаточная функция:</w:t>
+      </w:r>
+    </w:p>
+    <w:p>
+      <w:pPr>
+        <w:spacing w:before="120" w:after="120"/>
+        <w:jc w:val="center"/>
+      </w:pPr>
+      <w:r>
+        <w:rPr>
+          <w:rFonts w:ascii="Times New Roman" w:hAnsi="Times New Roman"/>
+          <w:i/>
+          <w:sz w:val="28"/>
+        </w:rPr>
+        <w:t>W(s) = (k) / (s)</w:t>
+      </w:r>
+      <w:r>
+        <w:rPr>
+          <w:rFonts w:ascii="Times New Roman" w:hAnsi="Times New Roman"/>
+          <w:sz w:val="28"/>
+        </w:rPr>
+        <w:tab/>
+        <w:t>(69)</w:t>
+      </w:r>
+    </w:p>
+    <w:p>
+      <w:pPr>
+        <w:spacing w:before="120" w:after="120"/>
+        <w:jc w:val="center"/>
+      </w:pPr>
+      <w:r>
+        <w:rPr>
+          <w:rFonts w:ascii="Times New Roman" w:hAnsi="Times New Roman"/>
+          <w:i/>
+          <w:sz w:val="28"/>
+        </w:rPr>
+        <w:t>Переходная функция растет линейно во времени: $h(t) = k · t$.</w:t>
+      </w:r>
+      <w:r>
+        <w:rPr>
+          <w:rFonts w:ascii="Times New Roman" w:hAnsi="Times New Roman"/>
+          <w:sz w:val="28"/>
+        </w:rPr>
+        <w:tab/>
+        <w:t>(70)</w:t>
+      </w:r>
+    </w:p>
+    <w:p>
+      <w:pPr>
+        <w:pStyle w:val="Heading3"/>
+      </w:pPr>
+      <w:r>
+        <w:t>2,3. Идеальное дифференцирующее звено</w:t>
+      </w:r>
+    </w:p>
+    <w:p>
+      <w:pPr/>
+      <w:r>
+        <w:t>Выходная величина пропорциональна скорости изменения входного сигнала. Оно реагирует не на само значение сигнала, а на тенденцию его изменения. На практике чистое дифференцирование реализовать невозможно (из-за бесконечной реакции на скачок), но оно используется математически.</w:t>
+      </w:r>
+    </w:p>
+    <w:p>
+      <w:pPr/>
+      <w:r>
+        <w:t>Уравнение звена:</w:t>
+      </w:r>
+    </w:p>
+    <w:p>
+      <w:pPr>
+        <w:spacing w:before="120" w:after="120"/>
+        <w:jc w:val="center"/>
+      </w:pPr>
+      <w:r>
+        <w:rPr>
+          <w:rFonts w:ascii="Times New Roman" w:hAnsi="Times New Roman"/>
+          <w:i/>
+          <w:sz w:val="28"/>
+        </w:rPr>
+        <w:t>y(t) = k · (du(t)) / (dt)</w:t>
+      </w:r>
+      <w:r>
+        <w:rPr>
+          <w:rFonts w:ascii="Times New Roman" w:hAnsi="Times New Roman"/>
+          <w:sz w:val="28"/>
+        </w:rPr>
+        <w:tab/>
+        <w:t>(71)</w:t>
+      </w:r>
+    </w:p>
+    <w:p>
+      <w:pPr/>
+      <w:r>
+        <w:t>Передаточная функция:</w:t>
+      </w:r>
+    </w:p>
+    <w:p>
+      <w:pPr>
+        <w:spacing w:before="120" w:after="120"/>
+        <w:jc w:val="center"/>
+      </w:pPr>
+      <w:r>
+        <w:rPr>
+          <w:rFonts w:ascii="Times New Roman" w:hAnsi="Times New Roman"/>
+          <w:i/>
+          <w:sz w:val="28"/>
+        </w:rPr>
+        <w:t>W(s) = k · s</w:t>
+      </w:r>
+      <w:r>
+        <w:rPr>
+          <w:rFonts w:ascii="Times New Roman" w:hAnsi="Times New Roman"/>
+          <w:sz w:val="28"/>
+        </w:rPr>
+        <w:tab/>
+        <w:t>(72)</w:t>
+      </w:r>
+    </w:p>
+    <w:p>
+      <w:pPr>
+        <w:spacing w:before="120" w:after="120"/>
+        <w:jc w:val="center"/>
+      </w:pPr>
+      <w:r>
+        <w:rPr>
+          <w:rFonts w:ascii="Times New Roman" w:hAnsi="Times New Roman"/>
+          <w:i/>
+          <w:sz w:val="28"/>
+        </w:rPr>
+        <w:t>Переходная функция представляет собой дельта-функцию $h(t) = k · δ(t)$.</w:t>
+      </w:r>
+      <w:r>
+        <w:rPr>
+          <w:rFonts w:ascii="Times New Roman" w:hAnsi="Times New Roman"/>
+          <w:sz w:val="28"/>
+        </w:rPr>
+        <w:tab/>
+        <w:t>(73)</w:t>
+      </w:r>
+    </w:p>
+    <w:p>
+      <w:pPr>
+        <w:pStyle w:val="Heading3"/>
+      </w:pPr>
+      <w:r>
+        <w:t>2,4. Апериодическое (инерционное) звено 1-го порядка</w:t>
+      </w:r>
+    </w:p>
+    <w:p>
+      <w:pPr/>
+      <w:r>
+        <w:t>Описывает элементы, обладающие одной емкостью для накопления энергии и одним диссипативным (рассеивающим) элементом. Например, нагрев печи, заряд конденсатора через резистор ($RC$-цепь), или электромагнитные процессы в обмотке возбуждения генератора ($RL$-цепь).</w:t>
+      </w:r>
+    </w:p>
+    <w:p>
+      <w:pPr/>
+      <w:r>
+        <w:t>Уравнение звена:</w:t>
+      </w:r>
+    </w:p>
+    <w:p>
+      <w:pPr>
+        <w:spacing w:before="120" w:after="120"/>
+        <w:jc w:val="center"/>
+      </w:pPr>
+      <w:r>
+        <w:rPr>
+          <w:rFonts w:ascii="Times New Roman" w:hAnsi="Times New Roman"/>
+          <w:i/>
+          <w:sz w:val="28"/>
+        </w:rPr>
+        <w:t>T (dy(t)) / (dt) + y(t) = k · u(t)</w:t>
+      </w:r>
+      <w:r>
+        <w:rPr>
+          <w:rFonts w:ascii="Times New Roman" w:hAnsi="Times New Roman"/>
+          <w:sz w:val="28"/>
+        </w:rPr>
+        <w:tab/>
+        <w:t>(74)</w:t>
+      </w:r>
+    </w:p>
+    <w:p>
+      <w:pPr/>
+      <w:r>
+        <w:t>где $T$ — постоянная времени звена (секунды), характеризующая его инерционность; $k$ — коэффициент передачи.</w:t>
+      </w:r>
+    </w:p>
+    <w:p>
+      <w:pPr/>
+      <w:r>
+        <w:t>Передаточная функция:</w:t>
+      </w:r>
+    </w:p>
+    <w:p>
+      <w:pPr>
+        <w:spacing w:before="120" w:after="120"/>
+        <w:jc w:val="center"/>
+      </w:pPr>
+      <w:r>
+        <w:rPr>
+          <w:rFonts w:ascii="Times New Roman" w:hAnsi="Times New Roman"/>
+          <w:i/>
+          <w:sz w:val="28"/>
+        </w:rPr>
+        <w:t>W(s) = (k) / (T s + 1)</w:t>
+      </w:r>
+      <w:r>
+        <w:rPr>
+          <w:rFonts w:ascii="Times New Roman" w:hAnsi="Times New Roman"/>
+          <w:sz w:val="28"/>
+        </w:rPr>
+        <w:tab/>
+        <w:t>(75)</w:t>
+      </w:r>
+    </w:p>
+    <w:p>
+      <w:pPr/>
+      <w:r>
+        <w:t>Переходная функция описывает экспоненциальный процесс установления нового значения:</w:t>
+      </w:r>
+    </w:p>
+    <w:p>
+      <w:pPr>
+        <w:spacing w:before="120" w:after="120"/>
+        <w:jc w:val="center"/>
+      </w:pPr>
+      <w:r>
+        <w:rPr>
+          <w:rFonts w:ascii="Times New Roman" w:hAnsi="Times New Roman"/>
+          <w:i/>
+          <w:sz w:val="28"/>
+        </w:rPr>
+        <w:t>h(t) = k (1 - e^(-(t) / (T)))</w:t>
+      </w:r>
+      <w:r>
+        <w:rPr>
+          <w:rFonts w:ascii="Times New Roman" w:hAnsi="Times New Roman"/>
+          <w:sz w:val="28"/>
+        </w:rPr>
+        <w:tab/>
+        <w:t>(76)</w:t>
+      </w:r>
+    </w:p>
+    <w:p>
+      <w:pPr/>
+      <w:r>
+        <w:t>Физический смысл постоянной времени $T$: это время, за которое выходная величина достигла бы установившегося значения, если бы скорость ее изменения оставалась равной начальной. Практически считается, что переходный процесс заканчивается (достигает $95$ % от номинала) за время $t \approx 3T$.</w:t>
+      </w:r>
+    </w:p>
+    <w:p>
+      <w:pPr>
+        <w:pStyle w:val="Heading3"/>
+      </w:pPr>
+      <w:r>
+        <w:t>2,5. Колебательное звено (2-го порядка)</w:t>
+      </w:r>
+    </w:p>
+    <w:p>
+      <w:pPr/>
+      <w:r>
+        <w:t>Звено содержит два накопителя энергии разного типа (например, индуктивность и емкость, или пружина и масса), между которыми может происходить обмен энергией, вызывающий колебания. Примером служит синхронный генератор, работающий параллельно с энергосистемой (обмен кинетической энергией ротора и электромагнитной энергией сети).</w:t>
+      </w:r>
+    </w:p>
+    <w:p>
+      <w:pPr/>
+      <w:r>
+        <w:t>Уравнение звена:</w:t>
+      </w:r>
+    </w:p>
+    <w:p>
+      <w:pPr>
+        <w:spacing w:before="120" w:after="120"/>
+        <w:jc w:val="center"/>
+      </w:pPr>
+      <w:r>
+        <w:rPr>
+          <w:rFonts w:ascii="Times New Roman" w:hAnsi="Times New Roman"/>
+          <w:i/>
+          <w:sz w:val="28"/>
+        </w:rPr>
+        <w:t>T^2 (d^2 y(t)) / (dt^2) + 2 xi T (dy(t)) / (dt) + y(t) = k · u(t)</w:t>
+      </w:r>
+      <w:r>
+        <w:rPr>
+          <w:rFonts w:ascii="Times New Roman" w:hAnsi="Times New Roman"/>
+          <w:sz w:val="28"/>
+        </w:rPr>
+        <w:tab/>
+        <w:t>(77)</w:t>
+      </w:r>
+    </w:p>
+    <w:p>
+      <w:pPr/>
+      <w:r>
+        <w:t>где $T$ — постоянная времени; $\xi$ (кси) — коэффициент демпфирования (затухания).</w:t>
+      </w:r>
+    </w:p>
+    <w:p>
+      <w:pPr/>
+      <w:r>
+        <w:t>Передаточная функция:</w:t>
+      </w:r>
+    </w:p>
+    <w:p>
+      <w:pPr>
+        <w:spacing w:before="120" w:after="120"/>
+        <w:jc w:val="center"/>
+      </w:pPr>
+      <w:r>
+        <w:rPr>
+          <w:rFonts w:ascii="Times New Roman" w:hAnsi="Times New Roman"/>
+          <w:i/>
+          <w:sz w:val="28"/>
+        </w:rPr>
+        <w:t>W(s) = (k) / (T^2 s^2 + 2 xi T s + 1)</w:t>
+      </w:r>
+      <w:r>
+        <w:rPr>
+          <w:rFonts w:ascii="Times New Roman" w:hAnsi="Times New Roman"/>
+          <w:sz w:val="28"/>
+        </w:rPr>
+        <w:tab/>
+        <w:t>(78)</w:t>
       </w:r>
     </w:p>
     <w:p>
@@ -2251,6 +3293,24 @@
       <w:pStyle w:val="Footer"/>
       <w:jc w:val="center"/>
     </w:pPr>
+    <w:r>
+      <w:rPr>
+        <w:rFonts w:ascii="Times New Roman" w:hAnsi="Times New Roman"/>
+        <w:sz w:val="28"/>
+      </w:rPr>
+      <w:fldChar w:fldCharType="begin"/>
+      <w:instrText xml:space="preserve"> PAGE </w:instrText>
+      <w:fldChar w:fldCharType="end"/>
+    </w:r>
+    <w:r>
+      <w:rPr>
+        <w:rFonts w:ascii="Times New Roman" w:hAnsi="Times New Roman"/>
+        <w:sz w:val="28"/>
+      </w:rPr>
+      <w:fldChar w:fldCharType="begin"/>
+      <w:instrText xml:space="preserve"> PAGE </w:instrText>
+      <w:fldChar w:fldCharType="end"/>
+    </w:r>
     <w:r>
       <w:rPr>
         <w:rFonts w:ascii="Times New Roman" w:hAnsi="Times New Roman"/>

</xml_diff>

<commit_message>
Fix execution dir and build docx
</commit_message>
<xml_diff>
--- a/Методичка_ТАУ.docx
+++ b/Методичка_ТАУ.docx
@@ -2,61 +2,6 @@
 <file path=word/document.xml><?xml version="1.0" encoding="utf-8"?>
 <w:document xmlns:wpc="http://schemas.microsoft.com/office/word/2010/wordprocessingCanvas" xmlns:mo="http://schemas.microsoft.com/office/mac/office/2008/main" xmlns:mc="http://schemas.openxmlformats.org/markup-compatibility/2006" xmlns:mv="urn:schemas-microsoft-com:mac:vml" xmlns:o="urn:schemas-microsoft-com:office:office" xmlns:r="http://schemas.openxmlformats.org/officeDocument/2006/relationships" xmlns:m="http://schemas.openxmlformats.org/officeDocument/2006/math" xmlns:v="urn:schemas-microsoft-com:vml" xmlns:wp14="http://schemas.microsoft.com/office/word/2010/wordprocessingDrawing" xmlns:wp="http://schemas.openxmlformats.org/drawingml/2006/wordprocessingDrawing" xmlns:w10="urn:schemas-microsoft-com:office:word" xmlns:w="http://schemas.openxmlformats.org/wordprocessingml/2006/main" xmlns:w14="http://schemas.microsoft.com/office/word/2010/wordml" xmlns:wpg="http://schemas.microsoft.com/office/word/2010/wordprocessingGroup" xmlns:wpi="http://schemas.microsoft.com/office/word/2010/wordprocessingInk" xmlns:wne="http://schemas.microsoft.com/office/word/2006/wordml" xmlns:wps="http://schemas.microsoft.com/office/word/2010/wordprocessingShape" mc:Ignorable="w14 wp14">
   <w:body>
-    <w:p>
-      <w:pPr>
-        <w:spacing w:after="0" w:before="0" w:line="240" w:lineRule="auto"/>
-        <w:jc w:val="center"/>
-      </w:pPr>
-      <w:r>
-        <w:rPr>
-          <w:rFonts w:ascii="Times New Roman" w:hAnsi="Times New Roman"/>
-          <w:b w:val="0"/>
-          <w:sz w:val="24"/>
-        </w:rPr>
-        <w:t>МИНИСТЕРСТВО НАУКИ И ВЫСШЕГО ОБРАЗОВАНИЯ</w:t>
-      </w:r>
-    </w:p>
-    <w:p>
-      <w:pPr>
-        <w:spacing w:after="0" w:before="0" w:line="240" w:lineRule="auto"/>
-        <w:jc w:val="center"/>
-      </w:pPr>
-      <w:r>
-        <w:rPr>
-          <w:rFonts w:ascii="Times New Roman" w:hAnsi="Times New Roman"/>
-          <w:b w:val="0"/>
-          <w:sz w:val="24"/>
-        </w:rPr>
-        <w:t>РОССИЙСКОЙ ФЕДЕРАЦИИ</w:t>
-      </w:r>
-    </w:p>
-    <w:p>
-      <w:pPr>
-        <w:spacing w:after="0" w:before="0" w:line="240" w:lineRule="auto"/>
-        <w:jc w:val="center"/>
-      </w:pPr>
-      <w:r>
-        <w:rPr>
-          <w:rFonts w:ascii="Times New Roman" w:hAnsi="Times New Roman"/>
-          <w:b w:val="0"/>
-          <w:sz w:val="12"/>
-        </w:rPr>
-      </w:r>
-    </w:p>
-    <w:p>
-      <w:pPr>
-        <w:spacing w:after="0" w:before="0" w:line="240" w:lineRule="auto"/>
-        <w:jc w:val="center"/>
-      </w:pPr>
-      <w:r>
-        <w:rPr>
-          <w:rFonts w:ascii="Times New Roman" w:hAnsi="Times New Roman"/>
-          <w:b/>
-          <w:sz w:val="28"/>
-        </w:rPr>
-        <w:t>УНИВЕРСИТЕТ</w:t>
-      </w:r>
-    </w:p>
     <w:p>
       <w:pPr>
         <w:spacing w:after="0" w:before="0" w:line="240" w:lineRule="auto"/>
@@ -119,49 +64,8 @@
         <w:rPr>
           <w:rFonts w:ascii="Times New Roman" w:hAnsi="Times New Roman"/>
           <w:b w:val="0"/>
-          <w:sz w:val="12"/>
-        </w:rPr>
-      </w:r>
-    </w:p>
-    <w:p>
-      <w:pPr>
-        <w:spacing w:after="0" w:before="0" w:line="240" w:lineRule="auto"/>
-        <w:jc w:val="center"/>
-      </w:pPr>
-      <w:r>
-        <w:rPr>
-          <w:rFonts w:ascii="Times New Roman" w:hAnsi="Times New Roman"/>
-          <w:b/>
-          <w:sz w:val="36"/>
-        </w:rPr>
-        <w:t>Теория автоматического управления в электроэнергетике</w:t>
-      </w:r>
-    </w:p>
-    <w:p>
-      <w:pPr>
-        <w:spacing w:after="0" w:before="0" w:line="240" w:lineRule="auto"/>
-        <w:jc w:val="center"/>
-      </w:pPr>
-      <w:r>
-        <w:rPr>
-          <w:rFonts w:ascii="Times New Roman" w:hAnsi="Times New Roman"/>
-          <w:b w:val="0"/>
-          <w:sz w:val="12"/>
-        </w:rPr>
-      </w:r>
-    </w:p>
-    <w:p>
-      <w:pPr>
-        <w:spacing w:after="0" w:before="0" w:line="240" w:lineRule="auto"/>
-        <w:jc w:val="center"/>
-      </w:pPr>
-      <w:r>
-        <w:rPr>
-          <w:rFonts w:ascii="Times New Roman" w:hAnsi="Times New Roman"/>
-          <w:b w:val="0"/>
           <w:sz w:val="28"/>
         </w:rPr>
-        <w:t>по дисциплине «ТАУ»</w:t>
       </w:r>
     </w:p>
     <w:p>
@@ -218,19 +122,6 @@
     </w:p>
     <w:p>
       <w:pPr>
-        <w:spacing w:after="0"/>
-        <w:jc w:val="right"/>
-      </w:pPr>
-      <w:r>
-        <w:rPr>
-          <w:rFonts w:ascii="Times New Roman" w:hAnsi="Times New Roman"/>
-          <w:sz w:val="28"/>
-        </w:rPr>
-        <w:t>Автор</w:t>
-      </w:r>
-    </w:p>
-    <w:p>
-      <w:pPr>
         <w:spacing w:after="0" w:before="0" w:line="240" w:lineRule="auto"/>
         <w:jc w:val="center"/>
       </w:pPr>
@@ -253,33 +144,6 @@
           <w:b w:val="0"/>
           <w:sz w:val="28"/>
         </w:rPr>
-      </w:r>
-    </w:p>
-    <w:p>
-      <w:pPr>
-        <w:spacing w:after="0" w:before="0" w:line="240" w:lineRule="auto"/>
-        <w:jc w:val="center"/>
-      </w:pPr>
-      <w:r>
-        <w:rPr>
-          <w:rFonts w:ascii="Times New Roman" w:hAnsi="Times New Roman"/>
-          <w:b w:val="0"/>
-          <w:sz w:val="28"/>
-        </w:rPr>
-      </w:r>
-    </w:p>
-    <w:p>
-      <w:pPr>
-        <w:spacing w:after="0" w:before="0" w:line="240" w:lineRule="auto"/>
-        <w:jc w:val="center"/>
-      </w:pPr>
-      <w:r>
-        <w:rPr>
-          <w:rFonts w:ascii="Times New Roman" w:hAnsi="Times New Roman"/>
-          <w:b w:val="0"/>
-          <w:sz w:val="28"/>
-        </w:rPr>
-        <w:t>Город — 2026</w:t>
       </w:r>
     </w:p>
     <w:p>
@@ -322,7 +186,13 @@
         <w:pStyle w:val="Heading1"/>
       </w:pPr>
       <w:r>
-        <w:t>Задание</w:t>
+        <w:t>Лекция 1. Введение в теорию автоматического управления. Основные понятия, термины и определения. Принципы управления</w:t>
+      </w:r>
+    </w:p>
+    <w:p>
+      <w:pPr/>
+      <w:r>
+        <w:t>Современная электроэнергетика немыслима без систем автоматического управления (САУ). Они обеспечивают стабильность частоты и напряжения в энергосистеме, автоматическое включение резерва, управление возбуждением генераторов и режимами работы турбин.</w:t>
       </w:r>
     </w:p>
     <w:p>
@@ -330,13 +200,19 @@
         <w:pStyle w:val="Heading2"/>
       </w:pPr>
       <w:r>
-        <w:t>Режим</w:t>
+        <w:t>1. Основные понятия и термины</w:t>
       </w:r>
     </w:p>
     <w:p>
       <w:pPr/>
       <w:r>
-        <w:t>создать</w:t>
+        <w:t>Теория автоматического управления (ТАУ) изучает общие принципы построения систем управления, а также методы анализа их динамических и статических свойств независимо от физической природы элементов.</w:t>
+      </w:r>
+    </w:p>
+    <w:p>
+      <w:pPr/>
+      <w:r>
+        <w:t>Основные элементы любой системы: * **Объект управления (ОУ)** — техническое устройство или технологический процесс (например, синхронный генератор, паровой котел, энергосистема), требующий целенаправленного воздействия извне для обеспечения заданного режима работы. * **Управляющее устройство (УУ)** — комплекс технических средств, осуществляющих сбор информации, ее обработку и формирование управляющих воздействий на объект. * **Система автоматического управления (САУ)** — совокупность объекта управления и управляющего устройства, взаимодействующих между собой без непосредственного участия человека.</w:t>
       </w:r>
     </w:p>
     <w:p>
@@ -344,13 +220,19 @@
         <w:pStyle w:val="Heading2"/>
       </w:pPr>
       <w:r>
-        <w:t>Целевой файл</w:t>
+        <w:t>2. Основные координаты САУ</w:t>
       </w:r>
     </w:p>
     <w:p>
       <w:pPr/>
       <w:r>
-        <w:t>../TAU/Методичка_ТАУ.docx</w:t>
+        <w:t>Функционирование системы описывается изменением во времени ряда физических величин: * **Управляемая (выходная) величина $y(t)$** — физическая величина, характеризующая состояние объекта управления (например, напряжение на выводах генератора или частота вращения ротора). * **Задающее воздействие $g(t)$** — сигнал, определяющий требуемый закон изменения управляемой величины (например, уставка регулятора напряжения). * **Управляющее воздействие $u(t)$** — сигнал, вырабатываемый управляющим устройством и подаваемый на исполнительный механизм объекта управления для изменения его состояния (например, ток возбуждения генератора). * **Возмущающее воздействие (возмущение) $f(t)$** — внешний или внутренний фактор, стремящийся отклонить управляемую величину от заданного значения (например, изменение тока нагрузки генератора, короткое замыкание).</w:t>
+      </w:r>
+    </w:p>
+    <w:p>
+      <w:pPr/>
+      <w:r>
+        <w:t>В идеале САУ должна обеспечивать выполнение условия: $y(t) \approx g(t)$ при любых возмущениях.</w:t>
       </w:r>
     </w:p>
     <w:p>
@@ -358,97 +240,27 @@
         <w:pStyle w:val="Heading2"/>
       </w:pPr>
       <w:r>
-        <w:t>Глава</w:t>
+        <w:t>3. Фундаментальные принципы управления</w:t>
       </w:r>
     </w:p>
     <w:p>
       <w:pPr/>
       <w:r>
-        <w:t>Лекция 1. Введение в ТАУ и электроэнергетику</w:t>
+        <w:t>В ТАУ существуют три основных принципа построения систем управления, определяющих способ формирования управляющего воздействия.</w:t>
       </w:r>
     </w:p>
     <w:p>
       <w:pPr>
-        <w:pStyle w:val="Heading2"/>
+        <w:pStyle w:val="Heading3"/>
       </w:pPr>
       <w:r>
-        <w:t>Позиция</w:t>
+        <w:t>3,1. Принцип управления по отклонению (принцип обратной связи, принцип Ползунова-Уатта)</w:t>
       </w:r>
     </w:p>
     <w:p>
       <w:pPr/>
       <w:r>
-        <w:t>в_конец</w:t>
-      </w:r>
-    </w:p>
-    <w:p>
-      <w:pPr/>
-      <w:r>
-        <w:t>---</w:t>
-      </w:r>
-    </w:p>
-    <w:p>
-      <w:pPr>
-        <w:pStyle w:val="Heading2"/>
-      </w:pPr>
-      <w:r>
-        <w:t>Текст</w:t>
-      </w:r>
-    </w:p>
-    <w:p>
-      <w:pPr>
-        <w:pStyle w:val="Heading1"/>
-      </w:pPr>
-      <w:r>
-        <w:t>Лекция 1. Введение в ТАУ и электроэнергетику. Основные понятия, терминология и классификация систем автоматического управления</w:t>
-      </w:r>
-    </w:p>
-    <w:p>
-      <w:pPr/>
-      <w:r>
-        <w:t>Теория автоматического управления (ТАУ) является фундаментальной научной дисциплиной, изучающей принципы построения и математические методы анализа систем, функционирующих без непосредственного участия человека. В современной электроэнергетике методы ТАУ лежат в основе работы всех ключевых узлов энергосистемы: от автоматических регуляторов возбуждения (АРВ) генераторов до систем противоаварийной автоматики и релейной защиты.</w:t>
-      </w:r>
-    </w:p>
-    <w:p>
-      <w:pPr>
-        <w:pStyle w:val="Heading2"/>
-      </w:pPr>
-      <w:r>
-        <w:t>1. Основные понятия и терминология ТАУ</w:t>
-      </w:r>
-    </w:p>
-    <w:p>
-      <w:pPr/>
-      <w:r>
-        <w:t>Любая система автоматического управления (САУ) состоит из двух главных взаимодействующих частей:</w:t>
-      </w:r>
-    </w:p>
-    <w:p>
-      <w:pPr>
-        <w:pStyle w:val="Heading1"/>
-      </w:pPr>
-      <w:r>
-        <w:t>1 **Объект управления (ОУ)** — устройство или технологический процесс, требующий поддержания заданного режима работы (например, синхронный генератор, трансформатор, линия электропередачи).</w:t>
-      </w:r>
-    </w:p>
-    <w:p>
-      <w:pPr>
-        <w:pStyle w:val="Heading1"/>
-      </w:pPr>
-      <w:r>
-        <w:t>2 **Управляющее устройство (УУ) или регулятор** — комплекс технических средств, осуществляющий сбор информации о состоянии ОУ и формирующий управляющие воздействия.</w:t>
-      </w:r>
-    </w:p>
-    <w:p>
-      <w:pPr/>
-      <w:r>
-        <w:t>Взаимодействие между элементами системы описывается следующими базовыми переменными: * **Задающее воздействие** $g(t)$ — сигнал, определяющий требуемый закон изменения управляемой величины. * **Управляемая (выходная) величина** $y(t)$ — физический параметр объекта, значение которого необходимо поддерживать на заданном уровне (например, напряжение статора генератора). * **Управляющее воздействие** $u(t)$ — сигнал, подаваемый от регулятора на исполнительный механизм объекта для коррекции его состояния. * **Возмущающее воздействие (возмущение)** $f(t)$ — внешний или внутренний фактор, нарушающий требуемый режим работы объекта (например, короткое замыкание в сети, резкий сброс или наброс нагрузки). * **Ошибка управления (рассогласование)** $e(t)$ — разность между задающим воздействием и действительным значением управляемой величины.</w:t>
-      </w:r>
-    </w:p>
-    <w:p>
-      <w:pPr/>
-      <w:r>
-        <w:t>Математически ошибка управления определяется выражением: e(t) = g(t) - y(t)</w:t>
+        <w:t>Это наиболее универсальный и широко применяемый принцип (например, в автоматических регуляторах возбуждения АРВ). Управляющее устройство непрерывно измеряет фактическое значение управляемой величины $y(t)$, сравнивает его с задающим воздействием $g(t)$ и вычисляет ошибку управления (рассогласование):</w:t>
       </w:r>
     </w:p>
     <w:p>
@@ -458,17 +270,15 @@
       </w:r>
     </w:p>
     <w:p>
-      <w:pPr>
-        <w:pStyle w:val="Heading2"/>
-      </w:pPr>
+      <w:pPr/>
       <w:r>
-        <w:t>2. Фундаментальные принципы управления</w:t>
+        <w:t>Управляющее воздействие формируется в зависимости от этой ошибки с целью свести ее к нулю. В такой системе информация передается от выхода объекта обратно на вход управляющего устройства (обратная связь).</w:t>
       </w:r>
     </w:p>
     <w:p>
       <w:pPr/>
       <w:r>
-        <w:t>В теории автоматического управления выделяют три основных принципа формирования управляющих воздействий:</w:t>
+        <w:t>**Достоинства:** высокая точность; система компенсирует влияние *любых* возмущений, даже тех, которые невозможно измерить или предвидеть; снижается чувствительность системы к изменению параметров самого объекта (старению, нагреву). **Недостатки:** наличие обратной связи может привести к неустойчивости (самовозбуждению) системы; управление начинается только *после* того, как выходная величина уже отклонилась от нормы.</w:t>
       </w:r>
     </w:p>
     <w:p>
@@ -476,127 +286,13 @@
         <w:pStyle w:val="Heading3"/>
       </w:pPr>
       <w:r>
-        <w:t>2,1. Принцип разомкнутого управления</w:t>
+        <w:t>3,2. Принцип управления по возмущению (принцип Понселе)</w:t>
       </w:r>
     </w:p>
     <w:p>
       <w:pPr/>
       <w:r>
-        <w:t>Управляющее воздействие $u(t)$ формируется только на основе задающего алгоритма без контроля фактического состояния управляемой величины $y(t)$. Достоинства: простота реализации. Недостатки: отсутствие компенсации внешних возмущений.</w:t>
-      </w:r>
-    </w:p>
-    <w:p>
-      <w:pPr>
-        <w:pStyle w:val="Heading3"/>
-      </w:pPr>
-      <w:r>
-        <w:t>2,2. Принцип управления по возмущению (принцип Понселе)</w:t>
-      </w:r>
-    </w:p>
-    <w:p>
-      <w:pPr/>
-      <w:r>
-        <w:t>Регулятор измеряет основное возмущающее воздействие $f(t)$ и формирует компенсирующий сигнал еще до того, как управляемая величина $y(t)$ отклонится от нормы. Закон управления в общем виде: u(t) = F(g(t), f(t))</w:t>
-      </w:r>
-    </w:p>
-    <w:p>
-      <w:pPr/>
-      <w:r>
-        <w:t>u(t) = F(g(t), f(t))</w:t>
-      </w:r>
-    </w:p>
-    <w:p>
-      <w:pPr/>
-      <w:r>
-        <w:t>Этот принцип обеспечивает высокую скорость реакции, однако требует установки датчиков на все существенные возмущения, что на практике реализовать крайне сложно.</w:t>
-      </w:r>
-    </w:p>
-    <w:p>
-      <w:pPr>
-        <w:pStyle w:val="Heading3"/>
-      </w:pPr>
-      <w:r>
-        <w:t>2,3. Принцип управления по отклонению (принцип Ползунова-Уатта)</w:t>
-      </w:r>
-    </w:p>
-    <w:p>
-      <w:pPr/>
-      <w:r>
-        <w:t>Это наиболее распространенный принцип, лежащий в основе работы систем с обратной связью (замкнутых систем). Управляющее воздействие формируется в зависимости от текущей ошибки управления $e(t)$. Закон управления: u(t) = F(e(t)) = F(g(t) - y(t))</w:t>
-      </w:r>
-    </w:p>
-    <w:p>
-      <w:pPr/>
-      <w:r>
-        <w:t>u(t) = F(e(t)) = F(g(t) - y(t))</w:t>
-      </w:r>
-    </w:p>
-    <w:p>
-      <w:pPr/>
-      <w:r>
-        <w:t>Главное преимущество данного метода заключается в том, что регулятор реагирует на любые возмущения (как измеряемые, так и неизмеряемые), вызывающие отклонение выходной координаты.</w:t>
-      </w:r>
-    </w:p>
-    <w:p>
-      <w:pPr>
-        <w:pStyle w:val="Heading2"/>
-      </w:pPr>
-      <w:r>
-        <w:t>3. Классификация систем автоматического управления</w:t>
-      </w:r>
-    </w:p>
-    <w:p>
-      <w:pPr/>
-      <w:r>
-        <w:t>Системы автоматического управления в электроэнергетике классифицируются по ряду базовых признаков:</w:t>
-      </w:r>
-    </w:p>
-    <w:p>
-      <w:pPr>
-        <w:pStyle w:val="Heading3"/>
-      </w:pPr>
-      <w:r>
-        <w:t>3,1. По характеру задающего воздействия</w:t>
-      </w:r>
-    </w:p>
-    <w:p>
-      <w:pPr>
-        <w:pStyle w:val="Heading1"/>
-      </w:pPr>
-      <w:r>
-        <w:t>1 **Системы стабилизации:** задающее воздействие постоянно во времени ($g(t) = \text{const}$). Цель — поддержание параметра на заданном уровне. Классический пример — АРВ генератора, поддерживающий номинальное напряжение $U_G = 1,0 \text{ о.е.}$</w:t>
-      </w:r>
-    </w:p>
-    <w:p>
-      <w:pPr>
-        <w:pStyle w:val="Heading1"/>
-      </w:pPr>
-      <w:r>
-        <w:t>2 **Системы программного управления:** задающее воздействие изменяется по заранее известному алгоритму.</w:t>
-      </w:r>
-    </w:p>
-    <w:p>
-      <w:pPr>
-        <w:pStyle w:val="Heading1"/>
-      </w:pPr>
-      <w:r>
-        <w:t>3 **Следящие системы:** задающее воздействие изменяется случайным, заранее неизвестным образом.</w:t>
-      </w:r>
-    </w:p>
-    <w:p>
-      <w:pPr>
-        <w:pStyle w:val="Heading3"/>
-      </w:pPr>
-      <w:r>
-        <w:t>3,2. По математическому описанию</w:t>
-      </w:r>
-    </w:p>
-    <w:p>
-      <w:pPr>
-        <w:pStyle w:val="Heading1"/>
-      </w:pPr>
-      <w:r>
-        <w:t>1 **Линейные системы:** описываются линейными дифференциальными или алгебраическими уравнениями. Для них справедлив принцип суперпозиции. Общий вид линейного дифференциального уравнения $n$-го порядка:</w:t>
+        <w:t>В этом случае управляющее воздействие формируется в зависимости от изменения главного возмущающего воздействия $f(t)$, еще до того, как оно успеет повлиять на выходную величину объекта. Управляющее устройство измеряет возмущение и формирует компенсирующий сигнал:</w:t>
       </w:r>
     </w:p>
     <w:p>
@@ -610,7 +306,7 @@
           <w:i/>
           <w:sz w:val="28"/>
         </w:rPr>
-        <w:t>a_n (d^n y) / (dt^n) + a_(n-1) frac{d^(n-1) y}{dt^(n-1)} + ... + a_0 y = b_m (d^m u) / (dt^m) + ... + b_0 u</w:t>
+        <w:t>u(t) = k · f(t)</w:t>
       </w:r>
       <w:r>
         <w:rPr>
@@ -622,39 +318,9 @@
       </w:r>
     </w:p>
     <w:p>
-      <w:pPr>
-        <w:spacing w:before="120" w:after="120"/>
-        <w:jc w:val="center"/>
-      </w:pPr>
-      <w:r>
-        <w:rPr>
-          <w:rFonts w:ascii="Times New Roman" w:hAnsi="Times New Roman"/>
-          <w:i/>
-          <w:sz w:val="28"/>
-        </w:rPr>
-        <w:t>a_n (d^n y) / (dt^n) + a_(n-1) frac{d^(n-1) y}{dt^(n-1)} + ... + a_0 y = b_m (d^m u) / (dt^m) + ... + b_0 u</w:t>
-      </w:r>
-      <w:r>
-        <w:rPr>
-          <w:rFonts w:ascii="Times New Roman" w:hAnsi="Times New Roman"/>
-          <w:sz w:val="28"/>
-        </w:rPr>
-        <w:tab/>
-        <w:t>(2)</w:t>
-      </w:r>
-    </w:p>
-    <w:p>
       <w:pPr/>
       <w:r>
-        <w:t>где $a_i$, $b_j$ — постоянные коэффициенты.</w:t>
-      </w:r>
-    </w:p>
-    <w:p>
-      <w:pPr>
-        <w:pStyle w:val="Heading1"/>
-      </w:pPr>
-      <w:r>
-        <w:t>2 **Нелинейные системы:** содержат элементы с нелинейными статическими характеристиками (насыщение магнитного провода трансформаторов, зоны нечувствительности реле, ограничения по току ротора генератора).</w:t>
+        <w:t>**Достоинства:** высокое быстродействие (возмущение компенсируется до изменения выходной координаты); система всегда абсолютно устойчива, так как нет замкнутого контура. **Недостатки:** невозможно компенсировать влияние других возмущений, которые не измеряются (например, изменение температуры или износ элементов); требуется точное знание характеристик объекта для подбора компенсатора.</w:t>
       </w:r>
     </w:p>
     <w:p>
@@ -662,43 +328,13 @@
         <w:pStyle w:val="Heading3"/>
       </w:pPr>
       <w:r>
-        <w:t>3,3. По характеру сигналов во времени</w:t>
-      </w:r>
-    </w:p>
-    <w:p>
-      <w:pPr>
-        <w:pStyle w:val="Heading1"/>
-      </w:pPr>
-      <w:r>
-        <w:t>1 **Непрерывные (аналоговые) системы:** все сигналы являются непрерывными функциями времени.</w:t>
-      </w:r>
-    </w:p>
-    <w:p>
-      <w:pPr>
-        <w:pStyle w:val="Heading1"/>
-      </w:pPr>
-      <w:r>
-        <w:t>2 **Дискретные системы:** сигналы квантуются по уровню, по времени или по обоим параметрам. В современной энергетике большинство регуляторов (микропроцессорные терминалы РЗА и АРВ) относятся к цифровым дискретным системам.</w:t>
-      </w:r>
-    </w:p>
-    <w:p>
-      <w:pPr>
-        <w:pStyle w:val="Heading2"/>
-      </w:pPr>
-      <w:r>
-        <w:t>4. Специфика ТАУ в электроэнергетике</w:t>
+        <w:t>3,3. Комбинированный принцип управления</w:t>
       </w:r>
     </w:p>
     <w:p>
       <w:pPr/>
       <w:r>
-        <w:t>Энергетическая система является одним из самых сложных объектов управления в технике. Ее особенности: * **Мгновенность протекания процессов:** электромагнитные переходные процессы развиваются за доли секунды. * **Строгий баланс:** производство электроэнергии должно в каждый момент времени в точности равняться ее потреблению (с учетом потерь в сетях). * **Многосвязность:** изменение режима работы одного генератора (например, изменение тока возбуждения) мгновенно отражается на параметрах всей сети.</w:t>
-      </w:r>
-    </w:p>
-    <w:p>
-      <w:pPr/>
-      <w:r>
-        <w:t>В связи с этим к регуляторам в энергетике (в особенности к АРВ) предъявляются жесткие требования по быстродействию, надежности и способности демпфировать низкочастотные колебания (колебания роторов синхронных машин), что будет подробно рассмотрено в следующих разделах нашего курса.</w:t>
+        <w:t>Объединяет преимущества первых двух методов. В комбинированной системе имеется замкнутый контур (обратная связь по отклонению) для точного поддержания выходной величины и компенсации неконтролируемых возмущений, а также разомкнутый канал компенсации основного, наиболее сильного возмущения. Например, в современных энергосистемах АРВ сильного действия регулирует напряжение генератора по отклонению напряжения (основной канал), но также имеет каналы управления по производной тока статора или частоты (по возмущению) для повышения динамической устойчивости.</w:t>
       </w:r>
     </w:p>
     <w:p>
@@ -746,7 +382,7 @@
           <w:i/>
           <w:sz w:val="28"/>
         </w:rPr>
-        <w:t>a_n (d^n y(t)) / (dt^n) + a_(n-1) frac{d^(n-1) y(t)}{dt^(n-1)} + ... + a_0 y(t) = b_m (d^m u(t)) / (dt^m) + ... + b_0 u(t)</w:t>
+        <w:t>a_n (d^n y(t)) / (dt^n) + a_(n-1) frac{d^(n-1) y(t)}{dt^(n-1)} +... + a_0 y(t) = b_m (d^m u(t)) / (dt^m) +... + b_0 u(t)</w:t>
       </w:r>
       <w:r>
         <w:rPr>
@@ -754,29 +390,7 @@
           <w:sz w:val="28"/>
         </w:rPr>
         <w:tab/>
-        <w:t>(3)</w:t>
-      </w:r>
-    </w:p>
-    <w:p>
-      <w:pPr>
-        <w:spacing w:before="120" w:after="120"/>
-        <w:jc w:val="center"/>
-      </w:pPr>
-      <w:r>
-        <w:rPr>
-          <w:rFonts w:ascii="Times New Roman" w:hAnsi="Times New Roman"/>
-          <w:i/>
-          <w:sz w:val="28"/>
-        </w:rPr>
-        <w:t>a_n (d^n y(t)) / (dt^n) + a_(n-1) frac{d^(n-1) y(t)}{dt^(n-1)} + ... + a_0 y(t) = b_m (d^m u(t)) / (dt^m) + ... + b_0 u(t)</w:t>
-      </w:r>
-      <w:r>
-        <w:rPr>
-          <w:rFonts w:ascii="Times New Roman" w:hAnsi="Times New Roman"/>
-          <w:sz w:val="28"/>
-        </w:rPr>
-        <w:tab/>
-        <w:t>(4)</w:t>
+        <w:t>(2)</w:t>
       </w:r>
     </w:p>
     <w:p>
@@ -804,7 +418,7 @@
           <w:sz w:val="28"/>
         </w:rPr>
         <w:tab/>
-        <w:t>(5)</w:t>
+        <w:t>(3)</w:t>
       </w:r>
     </w:p>
     <w:p>
@@ -818,7 +432,7 @@
           <w:i/>
           <w:sz w:val="28"/>
         </w:rPr>
-        <w:t>(a_n p^n + a_(n-1) p^(n-1) + ... + a_0) y(t) = (b_m p^m + ... + b_0) u(t)</w:t>
+        <w:t>(a_n p^n + a_(n-1) p^(n-1) +... + a_0) y(t) = (b_m p^m +... + b_0) u(t)</w:t>
       </w:r>
       <w:r>
         <w:rPr>
@@ -826,29 +440,7 @@
           <w:sz w:val="28"/>
         </w:rPr>
         <w:tab/>
-        <w:t>(6)</w:t>
-      </w:r>
-    </w:p>
-    <w:p>
-      <w:pPr>
-        <w:spacing w:before="120" w:after="120"/>
-        <w:jc w:val="center"/>
-      </w:pPr>
-      <w:r>
-        <w:rPr>
-          <w:rFonts w:ascii="Times New Roman" w:hAnsi="Times New Roman"/>
-          <w:i/>
-          <w:sz w:val="28"/>
-        </w:rPr>
-        <w:t>(a_n p^n + a_(n-1) p^(n-1) + ... + a_0) y(t) = (b_m p^m + ... + b_0) u(t)</w:t>
-      </w:r>
-      <w:r>
-        <w:rPr>
-          <w:rFonts w:ascii="Times New Roman" w:hAnsi="Times New Roman"/>
-          <w:sz w:val="28"/>
-        </w:rPr>
-        <w:tab/>
-        <w:t>(7)</w:t>
+        <w:t>(4)</w:t>
       </w:r>
     </w:p>
     <w:p>
@@ -878,7 +470,7 @@
           <w:sz w:val="28"/>
         </w:rPr>
         <w:tab/>
-        <w:t>(8)</w:t>
+        <w:t>(5)</w:t>
       </w:r>
     </w:p>
     <w:p>
@@ -906,29 +498,7 @@
           <w:sz w:val="28"/>
         </w:rPr>
         <w:tab/>
-        <w:t>(9)</w:t>
-      </w:r>
-    </w:p>
-    <w:p>
-      <w:pPr>
-        <w:spacing w:before="120" w:after="120"/>
-        <w:jc w:val="center"/>
-      </w:pPr>
-      <w:r>
-        <w:rPr>
-          <w:rFonts w:ascii="Times New Roman" w:hAnsi="Times New Roman"/>
-          <w:i/>
-          <w:sz w:val="28"/>
-        </w:rPr>
-        <w:t>F(s) = int_0^(infty) f(t) e^(-st) dt</w:t>
-      </w:r>
-      <w:r>
-        <w:rPr>
-          <w:rFonts w:ascii="Times New Roman" w:hAnsi="Times New Roman"/>
-          <w:sz w:val="28"/>
-        </w:rPr>
-        <w:tab/>
-        <w:t>(10)</w:t>
+        <w:t>(6)</w:t>
       </w:r>
     </w:p>
     <w:p>
@@ -956,29 +526,7 @@
           <w:sz w:val="28"/>
         </w:rPr>
         <w:tab/>
-        <w:t>(11)</w:t>
-      </w:r>
-    </w:p>
-    <w:p>
-      <w:pPr>
-        <w:spacing w:before="120" w:after="120"/>
-        <w:jc w:val="center"/>
-      </w:pPr>
-      <w:r>
-        <w:rPr>
-          <w:rFonts w:ascii="Times New Roman" w:hAnsi="Times New Roman"/>
-          <w:i/>
-          <w:sz w:val="28"/>
-        </w:rPr>
-        <w:t>L left\{ (df(t)) / (dt) right\} = s F(s)</w:t>
-      </w:r>
-      <w:r>
-        <w:rPr>
-          <w:rFonts w:ascii="Times New Roman" w:hAnsi="Times New Roman"/>
-          <w:sz w:val="28"/>
-        </w:rPr>
-        <w:tab/>
-        <w:t>(12)</w:t>
+        <w:t>(7)</w:t>
       </w:r>
     </w:p>
     <w:p>
@@ -998,7 +546,7 @@
           <w:i/>
           <w:sz w:val="28"/>
         </w:rPr>
-        <w:t>(a_n s^n + a_(n-1) s^(n-1) + ... + a_0) Y(s) = (b_m s^m + ... + b_0) U(s)</w:t>
+        <w:t>(a_n s^n + a_(n-1) s^(n-1) +... + a_0) Y(s) = (b_m s^m +... + b_0) U(s)</w:t>
       </w:r>
       <w:r>
         <w:rPr>
@@ -1006,29 +554,7 @@
           <w:sz w:val="28"/>
         </w:rPr>
         <w:tab/>
-        <w:t>(13)</w:t>
-      </w:r>
-    </w:p>
-    <w:p>
-      <w:pPr>
-        <w:spacing w:before="120" w:after="120"/>
-        <w:jc w:val="center"/>
-      </w:pPr>
-      <w:r>
-        <w:rPr>
-          <w:rFonts w:ascii="Times New Roman" w:hAnsi="Times New Roman"/>
-          <w:i/>
-          <w:sz w:val="28"/>
-        </w:rPr>
-        <w:t>(a_n s^n + a_(n-1) s^(n-1) + ... + a_0) Y(s) = (b_m s^m + ... + b_0) U(s)</w:t>
-      </w:r>
-      <w:r>
-        <w:rPr>
-          <w:rFonts w:ascii="Times New Roman" w:hAnsi="Times New Roman"/>
-          <w:sz w:val="28"/>
-        </w:rPr>
-        <w:tab/>
-        <w:t>(14)</w:t>
+        <w:t>(8)</w:t>
       </w:r>
     </w:p>
     <w:p>
@@ -1048,7 +574,7 @@
           <w:i/>
           <w:sz w:val="28"/>
         </w:rPr>
-        <w:t>W(s) = (Y(s)) / (U(s)) = (b_m s^m + ... + b_0) / (a_n s^n + a_(n-1) s^(n-1) + ... + a_0)</w:t>
+        <w:t>W(s) = (Y(s)) / (U(s)) = (b_m s^m +... + b_0) / (a_n s^n + a_(n-1) s^(n-1) +... + a_0)</w:t>
       </w:r>
       <w:r>
         <w:rPr>
@@ -1056,29 +582,7 @@
           <w:sz w:val="28"/>
         </w:rPr>
         <w:tab/>
-        <w:t>(15)</w:t>
-      </w:r>
-    </w:p>
-    <w:p>
-      <w:pPr>
-        <w:spacing w:before="120" w:after="120"/>
-        <w:jc w:val="center"/>
-      </w:pPr>
-      <w:r>
-        <w:rPr>
-          <w:rFonts w:ascii="Times New Roman" w:hAnsi="Times New Roman"/>
-          <w:i/>
-          <w:sz w:val="28"/>
-        </w:rPr>
-        <w:t>W(s) = (Y(s)) / (U(s)) = (b_m s^m + ... + b_0) / (a_n s^n + a_(n-1) s^(n-1) + ... + a_0)</w:t>
-      </w:r>
-      <w:r>
-        <w:rPr>
-          <w:rFonts w:ascii="Times New Roman" w:hAnsi="Times New Roman"/>
-          <w:sz w:val="28"/>
-        </w:rPr>
-        <w:tab/>
-        <w:t>(16)</w:t>
+        <w:t>(9)</w:t>
       </w:r>
     </w:p>
     <w:p>
@@ -1090,7 +594,7 @@
     <w:p>
       <w:pPr/>
       <w:r>
-        <w:t>Многочлен в знаменателе $D(s) = a_n s^n + ... + a_0$ называется характеристическим полиномом. Уравнение $D(s) = 0$ — это характеристическое уравнение системы. Корни этого уравнения называются **полюсами** передаточной функции. Многочлен в числителе $M(s) = b_m s^m + ... + b_0$ определяет **нули** передаточной функции. Полюса и нули полностью определяют характер переходных процессов в САУ.</w:t>
+        <w:t>Многочлен в знаменателе $D(s) = a_n s^n +... + a_0$ называется характеристическим полиномом. Уравнение $D(s) = 0$ — это характеристическое уравнение системы. Корни этого уравнения называются **полюсами** передаточной функции. Многочлен в числителе $M(s) = b_m s^m +... + b_0$ определяет **нули** передаточной функции. Полюса и нули полностью определяют характер переходных процессов в САУ.</w:t>
       </w:r>
     </w:p>
     <w:p>
@@ -1144,7 +648,7 @@
           <w:i/>
           <w:sz w:val="28"/>
         </w:rPr>
-        <w:t>W_(экв)(s) = W_1(s) · W_2(s) · ... · W_k(s) = prod_(i=1)^k W_i(s)</w:t>
+        <w:t>W_(экв)(s) = W_1(s) · W_2(s) ·... · W_k(s) = prod_(i=1)^k W_i(s)</w:t>
       </w:r>
       <w:r>
         <w:rPr>
@@ -1152,29 +656,7 @@
           <w:sz w:val="28"/>
         </w:rPr>
         <w:tab/>
-        <w:t>(17)</w:t>
-      </w:r>
-    </w:p>
-    <w:p>
-      <w:pPr>
-        <w:spacing w:before="120" w:after="120"/>
-        <w:jc w:val="center"/>
-      </w:pPr>
-      <w:r>
-        <w:rPr>
-          <w:rFonts w:ascii="Times New Roman" w:hAnsi="Times New Roman"/>
-          <w:i/>
-          <w:sz w:val="28"/>
-        </w:rPr>
-        <w:t>W_(экв)(s) = W_1(s) · W_2(s) · ... · W_k(s) = prod_(i=1)^k W_i(s)</w:t>
-      </w:r>
-      <w:r>
-        <w:rPr>
-          <w:rFonts w:ascii="Times New Roman" w:hAnsi="Times New Roman"/>
-          <w:sz w:val="28"/>
-        </w:rPr>
-        <w:tab/>
-        <w:t>(18)</w:t>
+        <w:t>(10)</w:t>
       </w:r>
     </w:p>
     <w:p>
@@ -1202,7 +684,7 @@
           <w:i/>
           <w:sz w:val="28"/>
         </w:rPr>
-        <w:t>W_(экв)(s) = W_1(s) + W_2(s) + ... + W_k(s) = sum_(i=1)^k W_i(s)</w:t>
+        <w:t>W_(экв)(s) = W_1(s) + W_2(s) +... + W_k(s) = sum_(i=1)^k W_i(s)</w:t>
       </w:r>
       <w:r>
         <w:rPr>
@@ -1210,29 +692,7 @@
           <w:sz w:val="28"/>
         </w:rPr>
         <w:tab/>
-        <w:t>(19)</w:t>
-      </w:r>
-    </w:p>
-    <w:p>
-      <w:pPr>
-        <w:spacing w:before="120" w:after="120"/>
-        <w:jc w:val="center"/>
-      </w:pPr>
-      <w:r>
-        <w:rPr>
-          <w:rFonts w:ascii="Times New Roman" w:hAnsi="Times New Roman"/>
-          <w:i/>
-          <w:sz w:val="28"/>
-        </w:rPr>
-        <w:t>W_(экв)(s) = W_1(s) + W_2(s) + ... + W_k(s) = sum_(i=1)^k W_i(s)</w:t>
-      </w:r>
-      <w:r>
-        <w:rPr>
-          <w:rFonts w:ascii="Times New Roman" w:hAnsi="Times New Roman"/>
-          <w:sz w:val="28"/>
-        </w:rPr>
-        <w:tab/>
-        <w:t>(20)</w:t>
+        <w:t>(11)</w:t>
       </w:r>
     </w:p>
     <w:p>
@@ -1274,1363 +734,7 @@
           <w:sz w:val="28"/>
         </w:rPr>
         <w:tab/>
-        <w:t>(21)</w:t>
-      </w:r>
-    </w:p>
-    <w:p>
-      <w:pPr>
-        <w:spacing w:before="120" w:after="120"/>
-        <w:jc w:val="center"/>
-      </w:pPr>
-      <w:r>
-        <w:rPr>
-          <w:rFonts w:ascii="Times New Roman" w:hAnsi="Times New Roman"/>
-          <w:i/>
-          <w:sz w:val="28"/>
-        </w:rPr>
-        <w:t>W_(экв)(s) = (W_1(s)) / (1 ± W_1(s) W_2(s))</w:t>
-      </w:r>
-      <w:r>
-        <w:rPr>
-          <w:rFonts w:ascii="Times New Roman" w:hAnsi="Times New Roman"/>
-          <w:sz w:val="28"/>
-        </w:rPr>
-        <w:tab/>
-        <w:t>(22)</w:t>
-      </w:r>
-    </w:p>
-    <w:p>
-      <w:pPr/>
-      <w:r>
-        <w:t>Уравнения структурных преобразований позволяют сводить сколь угодно сложные многоконтурные схемы энергосистем к одному эквивалентному звену с единой передаточной функцией. Это является первым и важнейшим этапом перед применением критериев устойчивости (Рауса, Гурвица, Найквиста), которые мы рассмотрим в последующих лекциях.</w:t>
-      </w:r>
-    </w:p>
-    <w:p>
-      <w:pPr>
-        <w:pStyle w:val="Heading1"/>
-      </w:pPr>
-      <w:r>
-        <w:t>Лекция 3. Временные характеристики типовых динамических звеньев и систем автоматического управления</w:t>
-      </w:r>
-    </w:p>
-    <w:p>
-      <w:pPr/>
-      <w:r>
-        <w:t>Поведение элементов электроэнергетической системы во времени является важнейшим фактором, определяющим надежность энергоснабжения. Для оценки динамических свойств звеньев систем автоматического управления (САУ) в классической теории применяются стандартные типовые воздействия. Реакция звена на такие воздействия называется его временной характеристикой.</w:t>
-      </w:r>
-    </w:p>
-    <w:p>
-      <w:pPr>
-        <w:pStyle w:val="Heading2"/>
-      </w:pPr>
-      <w:r>
-        <w:t>1. Типовые тестовые воздействия</w:t>
-      </w:r>
-    </w:p>
-    <w:p>
-      <w:pPr/>
-      <w:r>
-        <w:t>Для математического анализа динамики звеньев чаще всего используют два типовых входных сигнала:</w:t>
-      </w:r>
-    </w:p>
-    <w:p>
-      <w:pPr>
-        <w:pStyle w:val="Heading3"/>
-      </w:pPr>
-      <w:r>
-        <w:t>1,1. Единичная ступенчатая функция (функция Хевисайда)</w:t>
-      </w:r>
-    </w:p>
-    <w:p>
-      <w:pPr/>
-      <w:r>
-        <w:t>Этот сигнал имитирует мгновенное (скачкообразное) изменение входной величины, например, мгновенный сброс или наброс нагрузки генератора, короткое замыкание или включение рубильника. Обозначается $1(t)$ и математически определяется как:</w:t>
-      </w:r>
-    </w:p>
-    <w:p>
-      <w:pPr/>
-      <w:r>
-        <w:t>1(t) = \begin{cases} 0, &amp; t &lt; 0 \\ 1, &amp; t \ge 0 \end{cases}</w:t>
-      </w:r>
-    </w:p>
-    <w:p>
-      <w:pPr/>
-      <w:r>
-        <w:t>1(t) = \begin{cases} 0, &amp; t &lt; 0 \\ 1, &amp; t \ge 0 \end{cases}</w:t>
-      </w:r>
-    </w:p>
-    <w:p>
-      <w:pPr/>
-      <w:r>
-        <w:t>Изображение по Лапласу для единичной ступенчатой функции:</w:t>
-      </w:r>
-    </w:p>
-    <w:p>
-      <w:pPr>
-        <w:spacing w:before="120" w:after="120"/>
-        <w:jc w:val="center"/>
-      </w:pPr>
-      <w:r>
-        <w:rPr>
-          <w:rFonts w:ascii="Times New Roman" w:hAnsi="Times New Roman"/>
-          <w:i/>
-          <w:sz w:val="28"/>
-        </w:rPr>
-        <w:t>U(s) = (1) / (s)</w:t>
-      </w:r>
-      <w:r>
-        <w:rPr>
-          <w:rFonts w:ascii="Times New Roman" w:hAnsi="Times New Roman"/>
-          <w:sz w:val="28"/>
-        </w:rPr>
-        <w:tab/>
-        <w:t>(23)</w:t>
-      </w:r>
-    </w:p>
-    <w:p>
-      <w:pPr>
-        <w:spacing w:before="120" w:after="120"/>
-        <w:jc w:val="center"/>
-      </w:pPr>
-      <w:r>
-        <w:rPr>
-          <w:rFonts w:ascii="Times New Roman" w:hAnsi="Times New Roman"/>
-          <w:i/>
-          <w:sz w:val="28"/>
-        </w:rPr>
-        <w:t>U(s) = (1) / (s)</w:t>
-      </w:r>
-      <w:r>
-        <w:rPr>
-          <w:rFonts w:ascii="Times New Roman" w:hAnsi="Times New Roman"/>
-          <w:sz w:val="28"/>
-        </w:rPr>
-        <w:tab/>
-        <w:t>(24)</w:t>
-      </w:r>
-    </w:p>
-    <w:p>
-      <w:pPr/>
-      <w:r>
-        <w:t>Реакция системы при нулевых начальных условиях на единичное ступенчатое воздействие называется **переходной характеристикой (функцией)** и обозначается $h(t)$.</w:t>
-      </w:r>
-    </w:p>
-    <w:p>
-      <w:pPr>
-        <w:pStyle w:val="Heading3"/>
-      </w:pPr>
-      <w:r>
-        <w:t>1,2. Единичная импульсная функция (дельта-функция Дирака)</w:t>
-      </w:r>
-    </w:p>
-    <w:p>
-      <w:pPr/>
-      <w:r>
-        <w:t>Имитирует мгновенный удар бесконечной амплитуды, но с единичной площадью (единичным интегралом). Это может быть, например, удар молнии в линию электропередачи. Обозначается $\delta(t)$ и обладает следующими свойствами:</w:t>
-      </w:r>
-    </w:p>
-    <w:p>
-      <w:pPr>
-        <w:spacing w:before="120" w:after="120"/>
-        <w:jc w:val="center"/>
-      </w:pPr>
-      <w:r>
-        <w:rPr>
-          <w:rFonts w:ascii="Times New Roman" w:hAnsi="Times New Roman"/>
-          <w:i/>
-          <w:sz w:val="28"/>
-        </w:rPr>
-        <w:t>δ(t) = 0 при t ≠ 0, int_(-infty)^(infty) δ(t) dt = 1</w:t>
-      </w:r>
-      <w:r>
-        <w:rPr>
-          <w:rFonts w:ascii="Times New Roman" w:hAnsi="Times New Roman"/>
-          <w:sz w:val="28"/>
-        </w:rPr>
-        <w:tab/>
-        <w:t>(25)</w:t>
-      </w:r>
-    </w:p>
-    <w:p>
-      <w:pPr>
-        <w:spacing w:before="120" w:after="120"/>
-        <w:jc w:val="center"/>
-      </w:pPr>
-      <w:r>
-        <w:rPr>
-          <w:rFonts w:ascii="Times New Roman" w:hAnsi="Times New Roman"/>
-          <w:i/>
-          <w:sz w:val="28"/>
-        </w:rPr>
-        <w:t>δ(t) = 0 при t ≠ 0, int_(-infty)^(infty) δ(t) dt = 1</w:t>
-      </w:r>
-      <w:r>
-        <w:rPr>
-          <w:rFonts w:ascii="Times New Roman" w:hAnsi="Times New Roman"/>
-          <w:sz w:val="28"/>
-        </w:rPr>
-        <w:tab/>
-        <w:t>(26)</w:t>
-      </w:r>
-    </w:p>
-    <w:p>
-      <w:pPr/>
-      <w:r>
-        <w:t>Изображение по Лапласу для дельта-функции равно единице: $U(s) = 1$. Реакция системы при нулевых начальных условиях на дельта-функцию называется **весовой (или импульсной переходной) функцией** и обозначается $w(t)$.</w:t>
-      </w:r>
-    </w:p>
-    <w:p>
-      <w:pPr/>
-      <w:r>
-        <w:t>Поскольку дельта-функция является производной от функции Хевисайда, весовая функция является производной по времени от переходной функции:</w:t>
-      </w:r>
-    </w:p>
-    <w:p>
-      <w:pPr>
-        <w:spacing w:before="120" w:after="120"/>
-        <w:jc w:val="center"/>
-      </w:pPr>
-      <w:r>
-        <w:rPr>
-          <w:rFonts w:ascii="Times New Roman" w:hAnsi="Times New Roman"/>
-          <w:i/>
-          <w:sz w:val="28"/>
-        </w:rPr>
-        <w:t>w(t) = (dh(t)) / (dt)</w:t>
-      </w:r>
-      <w:r>
-        <w:rPr>
-          <w:rFonts w:ascii="Times New Roman" w:hAnsi="Times New Roman"/>
-          <w:sz w:val="28"/>
-        </w:rPr>
-        <w:tab/>
-        <w:t>(27)</w:t>
-      </w:r>
-    </w:p>
-    <w:p>
-      <w:pPr>
-        <w:spacing w:before="120" w:after="120"/>
-        <w:jc w:val="center"/>
-      </w:pPr>
-      <w:r>
-        <w:rPr>
-          <w:rFonts w:ascii="Times New Roman" w:hAnsi="Times New Roman"/>
-          <w:i/>
-          <w:sz w:val="28"/>
-        </w:rPr>
-        <w:t>w(t) = (dh(t)) / (dt)</w:t>
-      </w:r>
-      <w:r>
-        <w:rPr>
-          <w:rFonts w:ascii="Times New Roman" w:hAnsi="Times New Roman"/>
-          <w:sz w:val="28"/>
-        </w:rPr>
-        <w:tab/>
-        <w:t>(28)</w:t>
-      </w:r>
-    </w:p>
-    <w:p>
-      <w:pPr/>
-      <w:r>
-        <w:t>Связь временных характеристик с передаточной функцией $W(s)$: W(s) = L \{w(t)\} = s L \{h(t)\}</w:t>
-      </w:r>
-    </w:p>
-    <w:p>
-      <w:pPr/>
-      <w:r>
-        <w:t>W(s) = L \{w(t)\} = s L \{h(t)\}</w:t>
-      </w:r>
-    </w:p>
-    <w:p>
-      <w:pPr>
-        <w:pStyle w:val="Heading2"/>
-      </w:pPr>
-      <w:r>
-        <w:t>2. Типовые динамические звенья САУ</w:t>
-      </w:r>
-    </w:p>
-    <w:p>
-      <w:pPr/>
-      <w:r>
-        <w:t>Сложные системы могут быть разбиты на простейшие элементы, описываемые дифференциальными уравнениями не выше второго порядка. Такие элементы называют типовыми динамическими звеньями.</w:t>
-      </w:r>
-    </w:p>
-    <w:p>
-      <w:pPr>
-        <w:pStyle w:val="Heading3"/>
-      </w:pPr>
-      <w:r>
-        <w:t>2,1. Безынерционное (усилительное, пропорциональное) звено</w:t>
-      </w:r>
-    </w:p>
-    <w:p>
-      <w:pPr/>
-      <w:r>
-        <w:t>Звено, в котором выходная величина в любой момент времени строго пропорциональна входной величине. В нем отсутствуют элементы, накапливающие энергию (массы, индуктивности, емкости). В энергетике примером служит идеальный трансформатор напряжения или рычажная передача.</w:t>
-      </w:r>
-    </w:p>
-    <w:p>
-      <w:pPr/>
-      <w:r>
-        <w:t>Уравнение звена:</w:t>
-      </w:r>
-    </w:p>
-    <w:p>
-      <w:pPr>
-        <w:spacing w:before="120" w:after="120"/>
-        <w:jc w:val="center"/>
-      </w:pPr>
-      <w:r>
-        <w:rPr>
-          <w:rFonts w:ascii="Times New Roman" w:hAnsi="Times New Roman"/>
-          <w:i/>
-          <w:sz w:val="28"/>
-        </w:rPr>
-        <w:t>y(t) = k · u(t)</w:t>
-      </w:r>
-      <w:r>
-        <w:rPr>
-          <w:rFonts w:ascii="Times New Roman" w:hAnsi="Times New Roman"/>
-          <w:sz w:val="28"/>
-        </w:rPr>
-        <w:tab/>
-        <w:t>(29)</w:t>
-      </w:r>
-    </w:p>
-    <w:p>
-      <w:pPr>
-        <w:spacing w:before="120" w:after="120"/>
-        <w:jc w:val="center"/>
-      </w:pPr>
-      <w:r>
-        <w:rPr>
-          <w:rFonts w:ascii="Times New Roman" w:hAnsi="Times New Roman"/>
-          <w:i/>
-          <w:sz w:val="28"/>
-        </w:rPr>
-        <w:t>y(t) = k · u(t)</w:t>
-      </w:r>
-      <w:r>
-        <w:rPr>
-          <w:rFonts w:ascii="Times New Roman" w:hAnsi="Times New Roman"/>
-          <w:sz w:val="28"/>
-        </w:rPr>
-        <w:tab/>
-        <w:t>(30)</w:t>
-      </w:r>
-    </w:p>
-    <w:p>
-      <w:pPr/>
-      <w:r>
-        <w:t>где $k$ — коэффициент усиления (передачи).</w:t>
-      </w:r>
-    </w:p>
-    <w:p>
-      <w:pPr/>
-      <w:r>
-        <w:t>Передаточная функция: W(s) = k</w:t>
-      </w:r>
-    </w:p>
-    <w:p>
-      <w:pPr/>
-      <w:r>
-        <w:t>W(s) = k</w:t>
-      </w:r>
-    </w:p>
-    <w:p>
-      <w:pPr>
-        <w:spacing w:before="120" w:after="120"/>
-        <w:jc w:val="center"/>
-      </w:pPr>
-      <w:r>
-        <w:rPr>
-          <w:rFonts w:ascii="Times New Roman" w:hAnsi="Times New Roman"/>
-          <w:i/>
-          <w:sz w:val="28"/>
-        </w:rPr>
-        <w:t>Переходная функция представляет собой масштабированную ступенчатую функцию: $h(t) = k · 1(t)$.</w:t>
-      </w:r>
-      <w:r>
-        <w:rPr>
-          <w:rFonts w:ascii="Times New Roman" w:hAnsi="Times New Roman"/>
-          <w:sz w:val="28"/>
-        </w:rPr>
-        <w:tab/>
-        <w:t>(31)</w:t>
-      </w:r>
-    </w:p>
-    <w:p>
-      <w:pPr>
-        <w:pStyle w:val="Heading3"/>
-      </w:pPr>
-      <w:r>
-        <w:t>2,2. Интегрирующее звено</w:t>
-      </w:r>
-    </w:p>
-    <w:p>
-      <w:pPr/>
-      <w:r>
-        <w:t>В этом звене скорость изменения выходной величины пропорциональна входному сигналу. Это означает, что звено накапливает воздействие. Примером может служить электродвигатель постоянного тока (если вход — напряжение якоря, а выход — угол поворота вала) или резервуар с водой.</w:t>
-      </w:r>
-    </w:p>
-    <w:p>
-      <w:pPr/>
-      <w:r>
-        <w:t>Уравнение звена:</w:t>
-      </w:r>
-    </w:p>
-    <w:p>
-      <w:pPr>
-        <w:spacing w:before="120" w:after="120"/>
-        <w:jc w:val="center"/>
-      </w:pPr>
-      <w:r>
-        <w:rPr>
-          <w:rFonts w:ascii="Times New Roman" w:hAnsi="Times New Roman"/>
-          <w:i/>
-          <w:sz w:val="28"/>
-        </w:rPr>
-        <w:t>(dy(t)) / (dt) = k · u(t) implies y(t) = k int u(t) dt</w:t>
-      </w:r>
-      <w:r>
-        <w:rPr>
-          <w:rFonts w:ascii="Times New Roman" w:hAnsi="Times New Roman"/>
-          <w:sz w:val="28"/>
-        </w:rPr>
-        <w:tab/>
-        <w:t>(32)</w:t>
-      </w:r>
-    </w:p>
-    <w:p>
-      <w:pPr>
-        <w:spacing w:before="120" w:after="120"/>
-        <w:jc w:val="center"/>
-      </w:pPr>
-      <w:r>
-        <w:rPr>
-          <w:rFonts w:ascii="Times New Roman" w:hAnsi="Times New Roman"/>
-          <w:i/>
-          <w:sz w:val="28"/>
-        </w:rPr>
-        <w:t>(dy(t)) / (dt) = k · u(t) implies y(t) = k int u(t) dt</w:t>
-      </w:r>
-      <w:r>
-        <w:rPr>
-          <w:rFonts w:ascii="Times New Roman" w:hAnsi="Times New Roman"/>
-          <w:sz w:val="28"/>
-        </w:rPr>
-        <w:tab/>
-        <w:t>(33)</w:t>
-      </w:r>
-    </w:p>
-    <w:p>
-      <w:pPr/>
-      <w:r>
-        <w:t>Передаточная функция:</w:t>
-      </w:r>
-    </w:p>
-    <w:p>
-      <w:pPr>
-        <w:spacing w:before="120" w:after="120"/>
-        <w:jc w:val="center"/>
-      </w:pPr>
-      <w:r>
-        <w:rPr>
-          <w:rFonts w:ascii="Times New Roman" w:hAnsi="Times New Roman"/>
-          <w:i/>
-          <w:sz w:val="28"/>
-        </w:rPr>
-        <w:t>W(s) = (k) / (s)</w:t>
-      </w:r>
-      <w:r>
-        <w:rPr>
-          <w:rFonts w:ascii="Times New Roman" w:hAnsi="Times New Roman"/>
-          <w:sz w:val="28"/>
-        </w:rPr>
-        <w:tab/>
-        <w:t>(34)</w:t>
-      </w:r>
-    </w:p>
-    <w:p>
-      <w:pPr>
-        <w:spacing w:before="120" w:after="120"/>
-        <w:jc w:val="center"/>
-      </w:pPr>
-      <w:r>
-        <w:rPr>
-          <w:rFonts w:ascii="Times New Roman" w:hAnsi="Times New Roman"/>
-          <w:i/>
-          <w:sz w:val="28"/>
-        </w:rPr>
-        <w:t>W(s) = (k) / (s)</w:t>
-      </w:r>
-      <w:r>
-        <w:rPr>
-          <w:rFonts w:ascii="Times New Roman" w:hAnsi="Times New Roman"/>
-          <w:sz w:val="28"/>
-        </w:rPr>
-        <w:tab/>
-        <w:t>(35)</w:t>
-      </w:r>
-    </w:p>
-    <w:p>
-      <w:pPr>
-        <w:spacing w:before="120" w:after="120"/>
-        <w:jc w:val="center"/>
-      </w:pPr>
-      <w:r>
-        <w:rPr>
-          <w:rFonts w:ascii="Times New Roman" w:hAnsi="Times New Roman"/>
-          <w:i/>
-          <w:sz w:val="28"/>
-        </w:rPr>
-        <w:t>Переходная функция растет линейно во времени: $h(t) = k · t$.</w:t>
-      </w:r>
-      <w:r>
-        <w:rPr>
-          <w:rFonts w:ascii="Times New Roman" w:hAnsi="Times New Roman"/>
-          <w:sz w:val="28"/>
-        </w:rPr>
-        <w:tab/>
-        <w:t>(36)</w:t>
-      </w:r>
-    </w:p>
-    <w:p>
-      <w:pPr>
-        <w:pStyle w:val="Heading3"/>
-      </w:pPr>
-      <w:r>
-        <w:t>2,3. Идеальное дифференцирующее звено</w:t>
-      </w:r>
-    </w:p>
-    <w:p>
-      <w:pPr/>
-      <w:r>
-        <w:t>Выходная величина пропорциональна скорости изменения входного сигнала. Оно реагирует не на само значение сигнала, а на тенденцию его изменения. На практике чистое дифференцирование реализовать невозможно (из-за бесконечной реакции на скачок), но оно используется математически.</w:t>
-      </w:r>
-    </w:p>
-    <w:p>
-      <w:pPr/>
-      <w:r>
-        <w:t>Уравнение звена:</w:t>
-      </w:r>
-    </w:p>
-    <w:p>
-      <w:pPr>
-        <w:spacing w:before="120" w:after="120"/>
-        <w:jc w:val="center"/>
-      </w:pPr>
-      <w:r>
-        <w:rPr>
-          <w:rFonts w:ascii="Times New Roman" w:hAnsi="Times New Roman"/>
-          <w:i/>
-          <w:sz w:val="28"/>
-        </w:rPr>
-        <w:t>y(t) = k · (du(t)) / (dt)</w:t>
-      </w:r>
-      <w:r>
-        <w:rPr>
-          <w:rFonts w:ascii="Times New Roman" w:hAnsi="Times New Roman"/>
-          <w:sz w:val="28"/>
-        </w:rPr>
-        <w:tab/>
-        <w:t>(37)</w:t>
-      </w:r>
-    </w:p>
-    <w:p>
-      <w:pPr>
-        <w:spacing w:before="120" w:after="120"/>
-        <w:jc w:val="center"/>
-      </w:pPr>
-      <w:r>
-        <w:rPr>
-          <w:rFonts w:ascii="Times New Roman" w:hAnsi="Times New Roman"/>
-          <w:i/>
-          <w:sz w:val="28"/>
-        </w:rPr>
-        <w:t>y(t) = k · (du(t)) / (dt)</w:t>
-      </w:r>
-      <w:r>
-        <w:rPr>
-          <w:rFonts w:ascii="Times New Roman" w:hAnsi="Times New Roman"/>
-          <w:sz w:val="28"/>
-        </w:rPr>
-        <w:tab/>
-        <w:t>(38)</w:t>
-      </w:r>
-    </w:p>
-    <w:p>
-      <w:pPr/>
-      <w:r>
-        <w:t>Передаточная функция:</w:t>
-      </w:r>
-    </w:p>
-    <w:p>
-      <w:pPr>
-        <w:spacing w:before="120" w:after="120"/>
-        <w:jc w:val="center"/>
-      </w:pPr>
-      <w:r>
-        <w:rPr>
-          <w:rFonts w:ascii="Times New Roman" w:hAnsi="Times New Roman"/>
-          <w:i/>
-          <w:sz w:val="28"/>
-        </w:rPr>
-        <w:t>W(s) = k · s</w:t>
-      </w:r>
-      <w:r>
-        <w:rPr>
-          <w:rFonts w:ascii="Times New Roman" w:hAnsi="Times New Roman"/>
-          <w:sz w:val="28"/>
-        </w:rPr>
-        <w:tab/>
-        <w:t>(39)</w:t>
-      </w:r>
-    </w:p>
-    <w:p>
-      <w:pPr>
-        <w:spacing w:before="120" w:after="120"/>
-        <w:jc w:val="center"/>
-      </w:pPr>
-      <w:r>
-        <w:rPr>
-          <w:rFonts w:ascii="Times New Roman" w:hAnsi="Times New Roman"/>
-          <w:i/>
-          <w:sz w:val="28"/>
-        </w:rPr>
-        <w:t>W(s) = k · s</w:t>
-      </w:r>
-      <w:r>
-        <w:rPr>
-          <w:rFonts w:ascii="Times New Roman" w:hAnsi="Times New Roman"/>
-          <w:sz w:val="28"/>
-        </w:rPr>
-        <w:tab/>
-        <w:t>(40)</w:t>
-      </w:r>
-    </w:p>
-    <w:p>
-      <w:pPr>
-        <w:spacing w:before="120" w:after="120"/>
-        <w:jc w:val="center"/>
-      </w:pPr>
-      <w:r>
-        <w:rPr>
-          <w:rFonts w:ascii="Times New Roman" w:hAnsi="Times New Roman"/>
-          <w:i/>
-          <w:sz w:val="28"/>
-        </w:rPr>
-        <w:t>Переходная функция представляет собой дельта-функцию $h(t) = k · δ(t)$.</w:t>
-      </w:r>
-      <w:r>
-        <w:rPr>
-          <w:rFonts w:ascii="Times New Roman" w:hAnsi="Times New Roman"/>
-          <w:sz w:val="28"/>
-        </w:rPr>
-        <w:tab/>
-        <w:t>(41)</w:t>
-      </w:r>
-    </w:p>
-    <w:p>
-      <w:pPr>
-        <w:pStyle w:val="Heading3"/>
-      </w:pPr>
-      <w:r>
-        <w:t>2,4. Апериодическое (инерционное) звено 1-го порядка</w:t>
-      </w:r>
-    </w:p>
-    <w:p>
-      <w:pPr/>
-      <w:r>
-        <w:t>Описывает элементы, обладающие одной емкостью для накопления энергии и одним диссипативным (рассеивающим) элементом. Например, нагрев печи, заряд конденсатора через резистор ($RC$-цепь), или электромагнитные процессы в обмотке возбуждения генератора ($RL$-цепь).</w:t>
-      </w:r>
-    </w:p>
-    <w:p>
-      <w:pPr/>
-      <w:r>
-        <w:t>Уравнение звена:</w:t>
-      </w:r>
-    </w:p>
-    <w:p>
-      <w:pPr>
-        <w:spacing w:before="120" w:after="120"/>
-        <w:jc w:val="center"/>
-      </w:pPr>
-      <w:r>
-        <w:rPr>
-          <w:rFonts w:ascii="Times New Roman" w:hAnsi="Times New Roman"/>
-          <w:i/>
-          <w:sz w:val="28"/>
-        </w:rPr>
-        <w:t>T (dy(t)) / (dt) + y(t) = k · u(t)</w:t>
-      </w:r>
-      <w:r>
-        <w:rPr>
-          <w:rFonts w:ascii="Times New Roman" w:hAnsi="Times New Roman"/>
-          <w:sz w:val="28"/>
-        </w:rPr>
-        <w:tab/>
-        <w:t>(42)</w:t>
-      </w:r>
-    </w:p>
-    <w:p>
-      <w:pPr>
-        <w:spacing w:before="120" w:after="120"/>
-        <w:jc w:val="center"/>
-      </w:pPr>
-      <w:r>
-        <w:rPr>
-          <w:rFonts w:ascii="Times New Roman" w:hAnsi="Times New Roman"/>
-          <w:i/>
-          <w:sz w:val="28"/>
-        </w:rPr>
-        <w:t>T (dy(t)) / (dt) + y(t) = k · u(t)</w:t>
-      </w:r>
-      <w:r>
-        <w:rPr>
-          <w:rFonts w:ascii="Times New Roman" w:hAnsi="Times New Roman"/>
-          <w:sz w:val="28"/>
-        </w:rPr>
-        <w:tab/>
-        <w:t>(43)</w:t>
-      </w:r>
-    </w:p>
-    <w:p>
-      <w:pPr/>
-      <w:r>
-        <w:t>где $T$ — постоянная времени звена (секунды), характеризующая его инерционность; $k$ — коэффициент передачи.</w:t>
-      </w:r>
-    </w:p>
-    <w:p>
-      <w:pPr/>
-      <w:r>
-        <w:t>Передаточная функция:</w:t>
-      </w:r>
-    </w:p>
-    <w:p>
-      <w:pPr>
-        <w:spacing w:before="120" w:after="120"/>
-        <w:jc w:val="center"/>
-      </w:pPr>
-      <w:r>
-        <w:rPr>
-          <w:rFonts w:ascii="Times New Roman" w:hAnsi="Times New Roman"/>
-          <w:i/>
-          <w:sz w:val="28"/>
-        </w:rPr>
-        <w:t>W(s) = (k) / (T s + 1)</w:t>
-      </w:r>
-      <w:r>
-        <w:rPr>
-          <w:rFonts w:ascii="Times New Roman" w:hAnsi="Times New Roman"/>
-          <w:sz w:val="28"/>
-        </w:rPr>
-        <w:tab/>
-        <w:t>(44)</w:t>
-      </w:r>
-    </w:p>
-    <w:p>
-      <w:pPr>
-        <w:spacing w:before="120" w:after="120"/>
-        <w:jc w:val="center"/>
-      </w:pPr>
-      <w:r>
-        <w:rPr>
-          <w:rFonts w:ascii="Times New Roman" w:hAnsi="Times New Roman"/>
-          <w:i/>
-          <w:sz w:val="28"/>
-        </w:rPr>
-        <w:t>W(s) = (k) / (T s + 1)</w:t>
-      </w:r>
-      <w:r>
-        <w:rPr>
-          <w:rFonts w:ascii="Times New Roman" w:hAnsi="Times New Roman"/>
-          <w:sz w:val="28"/>
-        </w:rPr>
-        <w:tab/>
-        <w:t>(45)</w:t>
-      </w:r>
-    </w:p>
-    <w:p>
-      <w:pPr/>
-      <w:r>
-        <w:t>Переходная функция описывает экспоненциальный процесс установления нового значения:</w:t>
-      </w:r>
-    </w:p>
-    <w:p>
-      <w:pPr>
-        <w:spacing w:before="120" w:after="120"/>
-        <w:jc w:val="center"/>
-      </w:pPr>
-      <w:r>
-        <w:rPr>
-          <w:rFonts w:ascii="Times New Roman" w:hAnsi="Times New Roman"/>
-          <w:i/>
-          <w:sz w:val="28"/>
-        </w:rPr>
-        <w:t>h(t) = k (1 - e^(-(t) / (T)))</w:t>
-      </w:r>
-      <w:r>
-        <w:rPr>
-          <w:rFonts w:ascii="Times New Roman" w:hAnsi="Times New Roman"/>
-          <w:sz w:val="28"/>
-        </w:rPr>
-        <w:tab/>
-        <w:t>(46)</w:t>
-      </w:r>
-    </w:p>
-    <w:p>
-      <w:pPr>
-        <w:spacing w:before="120" w:after="120"/>
-        <w:jc w:val="center"/>
-      </w:pPr>
-      <w:r>
-        <w:rPr>
-          <w:rFonts w:ascii="Times New Roman" w:hAnsi="Times New Roman"/>
-          <w:i/>
-          <w:sz w:val="28"/>
-        </w:rPr>
-        <w:t>h(t) = k (1 - e^(-(t) / (T)))</w:t>
-      </w:r>
-      <w:r>
-        <w:rPr>
-          <w:rFonts w:ascii="Times New Roman" w:hAnsi="Times New Roman"/>
-          <w:sz w:val="28"/>
-        </w:rPr>
-        <w:tab/>
-        <w:t>(47)</w:t>
-      </w:r>
-    </w:p>
-    <w:p>
-      <w:pPr/>
-      <w:r>
-        <w:t>Физический смысл постоянной времени $T$: это время, за которое выходная величина достигла бы установившегося значения, если бы скорость ее изменения оставалась равной начальной. Практически считается, что переходный процесс заканчивается (достигает $95$ % от номинала) за время $t \approx 3T$.</w:t>
-      </w:r>
-    </w:p>
-    <w:p>
-      <w:pPr>
-        <w:pStyle w:val="Heading3"/>
-      </w:pPr>
-      <w:r>
-        <w:t>2,5. Колебательное звено (2-го порядка)</w:t>
-      </w:r>
-    </w:p>
-    <w:p>
-      <w:pPr/>
-      <w:r>
-        <w:t>Звено содержит два накопителя энергии разного типа (например, индуктивность и емкость, или пружина и масса), между которыми может происходить обмен энергией, вызывающий колебания. Примером служит синхронный генератор, работающий параллельно с энергосистемой (обмен кинетической энергией ротора и электромагнитной энергией сети).</w:t>
-      </w:r>
-    </w:p>
-    <w:p>
-      <w:pPr/>
-      <w:r>
-        <w:t>Уравнение звена:</w:t>
-      </w:r>
-    </w:p>
-    <w:p>
-      <w:pPr>
-        <w:spacing w:before="120" w:after="120"/>
-        <w:jc w:val="center"/>
-      </w:pPr>
-      <w:r>
-        <w:rPr>
-          <w:rFonts w:ascii="Times New Roman" w:hAnsi="Times New Roman"/>
-          <w:i/>
-          <w:sz w:val="28"/>
-        </w:rPr>
-        <w:t>T^2 (d^2 y(t)) / (dt^2) + 2 xi T (dy(t)) / (dt) + y(t) = k · u(t)</w:t>
-      </w:r>
-      <w:r>
-        <w:rPr>
-          <w:rFonts w:ascii="Times New Roman" w:hAnsi="Times New Roman"/>
-          <w:sz w:val="28"/>
-        </w:rPr>
-        <w:tab/>
-        <w:t>(48)</w:t>
-      </w:r>
-    </w:p>
-    <w:p>
-      <w:pPr>
-        <w:spacing w:before="120" w:after="120"/>
-        <w:jc w:val="center"/>
-      </w:pPr>
-      <w:r>
-        <w:rPr>
-          <w:rFonts w:ascii="Times New Roman" w:hAnsi="Times New Roman"/>
-          <w:i/>
-          <w:sz w:val="28"/>
-        </w:rPr>
-        <w:t>T^2 (d^2 y(t)) / (dt^2) + 2 xi T (dy(t)) / (dt) + y(t) = k · u(t)</w:t>
-      </w:r>
-      <w:r>
-        <w:rPr>
-          <w:rFonts w:ascii="Times New Roman" w:hAnsi="Times New Roman"/>
-          <w:sz w:val="28"/>
-        </w:rPr>
-        <w:tab/>
-        <w:t>(49)</w:t>
-      </w:r>
-    </w:p>
-    <w:p>
-      <w:pPr/>
-      <w:r>
-        <w:t>где $T$ — постоянная времени; $\xi$ (кси) — коэффициент демпфирования (затухания).</w:t>
-      </w:r>
-    </w:p>
-    <w:p>
-      <w:pPr/>
-      <w:r>
-        <w:t>Передаточная функция:</w:t>
-      </w:r>
-    </w:p>
-    <w:p>
-      <w:pPr>
-        <w:spacing w:before="120" w:after="120"/>
-        <w:jc w:val="center"/>
-      </w:pPr>
-      <w:r>
-        <w:rPr>
-          <w:rFonts w:ascii="Times New Roman" w:hAnsi="Times New Roman"/>
-          <w:i/>
-          <w:sz w:val="28"/>
-        </w:rPr>
-        <w:t>W(s) = (k) / (T^2 s^2 + 2 xi T s + 1)</w:t>
-      </w:r>
-      <w:r>
-        <w:rPr>
-          <w:rFonts w:ascii="Times New Roman" w:hAnsi="Times New Roman"/>
-          <w:sz w:val="28"/>
-        </w:rPr>
-        <w:tab/>
-        <w:t>(50)</w:t>
-      </w:r>
-    </w:p>
-    <w:p>
-      <w:pPr>
-        <w:spacing w:before="120" w:after="120"/>
-        <w:jc w:val="center"/>
-      </w:pPr>
-      <w:r>
-        <w:rPr>
-          <w:rFonts w:ascii="Times New Roman" w:hAnsi="Times New Roman"/>
-          <w:i/>
-          <w:sz w:val="28"/>
-        </w:rPr>
-        <w:t>W(s) = (k) / (T^2 s^2 + 2 xi T s + 1)</w:t>
-      </w:r>
-      <w:r>
-        <w:rPr>
-          <w:rFonts w:ascii="Times New Roman" w:hAnsi="Times New Roman"/>
-          <w:sz w:val="28"/>
-        </w:rPr>
-        <w:tab/>
-        <w:t>(51)</w:t>
-      </w:r>
-    </w:p>
-    <w:p>
-      <w:pPr/>
-      <w:r>
-        <w:t>Вид переходного процесса зависит от коэффициента демпфирования: * При $\xi &lt; 1$ корни характеристического уравнения комплексно-сопряженные. Переходный процесс носит затухающий колебательный характер (перерегулирование). * При $\xi \ge 1$ процесс теряет колебательность и становится апериодическим (звено разбивается на два апериодических звена 1-го порядка). В энергетике для надежной работы АРВ стремятся настроить параметры системы так, чтобы обеспечить хорошее демпфирование ($\xi \approx 0,7 \div 0,9$) и предотвратить раскачивание параметров сети.</w:t>
-      </w:r>
-    </w:p>
-    <w:p>
-      <w:pPr>
-        <w:pStyle w:val="Heading1"/>
-      </w:pPr>
-      <w:r>
-        <w:t>Лекция 2. Математическое описание линейных непрерывных систем. Дифференциальные уравнения и передаточные функции</w:t>
-      </w:r>
-    </w:p>
-    <w:p>
-      <w:pPr/>
-      <w:r>
-        <w:t>Любая автоматическая система состоит из взаимосвязанных динамических звеньев. Для того чтобы проанализировать работу системы автоматического управления (САУ) в переходных и установившихся режимах, необходимо иметь ее адекватную математическую модель.</w:t>
-      </w:r>
-    </w:p>
-    <w:p>
-      <w:pPr/>
-      <w:r>
-        <w:t>В классической теории автоматического управления (ТАУ) динамика линейных непрерывных систем описывается обыкновенными линейными дифференциальными уравнениями с постоянными коэффициентами.</w:t>
-      </w:r>
-    </w:p>
-    <w:p>
-      <w:pPr>
-        <w:pStyle w:val="Heading2"/>
-      </w:pPr>
-      <w:r>
-        <w:t>1. Дифференциальные уравнения динамических систем</w:t>
-      </w:r>
-    </w:p>
-    <w:p>
-      <w:pPr/>
-      <w:r>
-        <w:t>Пусть $u(t)$ — входное воздействие на систему (или отдельное звено), а $y(t)$ — выходная координата (реакция системы). В общем случае связь между ними описывается линейным дифференциальным уравнением $n$-го порядка:</w:t>
-      </w:r>
-    </w:p>
-    <w:p>
-      <w:pPr>
-        <w:spacing w:before="120" w:after="120"/>
-        <w:jc w:val="center"/>
-      </w:pPr>
-      <w:r>
-        <w:rPr>
-          <w:rFonts w:ascii="Times New Roman" w:hAnsi="Times New Roman"/>
-          <w:i/>
-          <w:sz w:val="28"/>
-        </w:rPr>
-        <w:t>a_n (d^n y(t)) / (dt^n) + a_(n-1) frac{d^(n-1) y(t)}{dt^(n-1)} + ... + a_0 y(t) = b_m (d^m u(t)) / (dt^m) + ... + b_0 u(t)</w:t>
-      </w:r>
-      <w:r>
-        <w:rPr>
-          <w:rFonts w:ascii="Times New Roman" w:hAnsi="Times New Roman"/>
-          <w:sz w:val="28"/>
-        </w:rPr>
-        <w:tab/>
-        <w:t>(52)</w:t>
-      </w:r>
-    </w:p>
-    <w:p>
-      <w:pPr/>
-      <w:r>
-        <w:t>где $a_i$ и $b_j$ — постоянные коэффициенты, определяемые физическими (конструктивными) параметрами системы (массами, индуктивностями, емкостями, сопротивлениями и т.д.). Для физически реализуемых макроскопических систем всегда выполняется условие $n \ge m$, что отражает свойство инерционности реальных объектов: выходная координата не может изменяться мгновенно при бесконечно быстром изменении входного сигнала.</w:t>
-      </w:r>
-    </w:p>
-    <w:p>
-      <w:pPr>
-        <w:spacing w:before="120" w:after="120"/>
-        <w:jc w:val="center"/>
-      </w:pPr>
-      <w:r>
-        <w:rPr>
-          <w:rFonts w:ascii="Times New Roman" w:hAnsi="Times New Roman"/>
-          <w:i/>
-          <w:sz w:val="28"/>
-        </w:rPr>
-        <w:t>Для удобства анализа дифференциальное уравнение часто записывают в операторной форме, используя символ дифференцирования $p = (d) / (dt)$:</w:t>
-      </w:r>
-      <w:r>
-        <w:rPr>
-          <w:rFonts w:ascii="Times New Roman" w:hAnsi="Times New Roman"/>
-          <w:sz w:val="28"/>
-        </w:rPr>
-        <w:tab/>
-        <w:t>(53)</w:t>
-      </w:r>
-    </w:p>
-    <w:p>
-      <w:pPr>
-        <w:spacing w:before="120" w:after="120"/>
-        <w:jc w:val="center"/>
-      </w:pPr>
-      <w:r>
-        <w:rPr>
-          <w:rFonts w:ascii="Times New Roman" w:hAnsi="Times New Roman"/>
-          <w:i/>
-          <w:sz w:val="28"/>
-        </w:rPr>
-        <w:t>(a_n p^n + a_(n-1) p^(n-1) + ... + a_0) y(t) = (b_m p^m + ... + b_0) u(t)</w:t>
-      </w:r>
-      <w:r>
-        <w:rPr>
-          <w:rFonts w:ascii="Times New Roman" w:hAnsi="Times New Roman"/>
-          <w:sz w:val="28"/>
-        </w:rPr>
-        <w:tab/>
-        <w:t>(54)</w:t>
-      </w:r>
-    </w:p>
-    <w:p>
-      <w:pPr>
-        <w:pStyle w:val="Heading2"/>
-      </w:pPr>
-      <w:r>
-        <w:t>2. Преобразование Лапласа и передаточная функция</w:t>
-      </w:r>
-    </w:p>
-    <w:p>
-      <w:pPr>
-        <w:spacing w:before="120" w:after="120"/>
-        <w:jc w:val="center"/>
-      </w:pPr>
-      <w:r>
-        <w:rPr>
-          <w:rFonts w:ascii="Times New Roman" w:hAnsi="Times New Roman"/>
-          <w:i/>
-          <w:sz w:val="28"/>
-        </w:rPr>
-        <w:t>Непосредственное решение дифференциальных уравнений высоких порядков для сложной многоконтурной системы — крайне трудоемкая задача. Метод, который радикально упрощает анализ, основан на преобразовании Лапласа. Это интегральное преобразование переводит функции вещественного переменного (времени $t$) в функции комплексного переменного $s = α + jω$.</w:t>
-      </w:r>
-      <w:r>
-        <w:rPr>
-          <w:rFonts w:ascii="Times New Roman" w:hAnsi="Times New Roman"/>
-          <w:sz w:val="28"/>
-        </w:rPr>
-        <w:tab/>
-        <w:t>(55)</w:t>
-      </w:r>
-    </w:p>
-    <w:p>
-      <w:pPr/>
-      <w:r>
-        <w:t>Прямое преобразование Лапласа для функции времени $f(t)$ определяется интегралом:</w:t>
-      </w:r>
-    </w:p>
-    <w:p>
-      <w:pPr>
-        <w:spacing w:before="120" w:after="120"/>
-        <w:jc w:val="center"/>
-      </w:pPr>
-      <w:r>
-        <w:rPr>
-          <w:rFonts w:ascii="Times New Roman" w:hAnsi="Times New Roman"/>
-          <w:i/>
-          <w:sz w:val="28"/>
-        </w:rPr>
-        <w:t>F(s) = int_0^(infty) f(t) e^(-st) dt</w:t>
-      </w:r>
-      <w:r>
-        <w:rPr>
-          <w:rFonts w:ascii="Times New Roman" w:hAnsi="Times New Roman"/>
-          <w:sz w:val="28"/>
-        </w:rPr>
-        <w:tab/>
-        <w:t>(56)</w:t>
-      </w:r>
-    </w:p>
-    <w:p>
-      <w:pPr/>
-      <w:r>
-        <w:t>Главное свойство преобразования Лапласа заключается в том, что операция дифференцирования оригинала во временной области заменяется алгебраической операцией умножения изображения на комплексную переменную $s$ (при нулевых начальных условиях):</w:t>
-      </w:r>
-    </w:p>
-    <w:p>
-      <w:pPr>
-        <w:spacing w:before="120" w:after="120"/>
-        <w:jc w:val="center"/>
-      </w:pPr>
-      <w:r>
-        <w:rPr>
-          <w:rFonts w:ascii="Times New Roman" w:hAnsi="Times New Roman"/>
-          <w:i/>
-          <w:sz w:val="28"/>
-        </w:rPr>
-        <w:t>L left\{ (df(t)) / (dt) right\} = s F(s)</w:t>
-      </w:r>
-      <w:r>
-        <w:rPr>
-          <w:rFonts w:ascii="Times New Roman" w:hAnsi="Times New Roman"/>
-          <w:sz w:val="28"/>
-        </w:rPr>
-        <w:tab/>
-        <w:t>(57)</w:t>
-      </w:r>
-    </w:p>
-    <w:p>
-      <w:pPr/>
-      <w:r>
-        <w:t>Применяя преобразование Лапласа к дифференциальному уравнению звена при нулевых начальных условиях (когда до момента $t=0$ система находилась в покое), мы переходим от дифференциального уравнения к алгебраическому:</w:t>
-      </w:r>
-    </w:p>
-    <w:p>
-      <w:pPr>
-        <w:spacing w:before="120" w:after="120"/>
-        <w:jc w:val="center"/>
-      </w:pPr>
-      <w:r>
-        <w:rPr>
-          <w:rFonts w:ascii="Times New Roman" w:hAnsi="Times New Roman"/>
-          <w:i/>
-          <w:sz w:val="28"/>
-        </w:rPr>
-        <w:t>(a_n s^n + a_(n-1) s^(n-1) + ... + a_0) Y(s) = (b_m s^m + ... + b_0) U(s)</w:t>
-      </w:r>
-      <w:r>
-        <w:rPr>
-          <w:rFonts w:ascii="Times New Roman" w:hAnsi="Times New Roman"/>
-          <w:sz w:val="28"/>
-        </w:rPr>
-        <w:tab/>
-        <w:t>(58)</w:t>
-      </w:r>
-    </w:p>
-    <w:p>
-      <w:pPr/>
-      <w:r>
-        <w:t>Здесь $Y(s)$ и $U(s)$ — изображения Лапласа выходного и входного сигналов соответственно. Выразим отношение изображения выходной величины к изображению входной:</w:t>
-      </w:r>
-    </w:p>
-    <w:p>
-      <w:pPr>
-        <w:spacing w:before="120" w:after="120"/>
-        <w:jc w:val="center"/>
-      </w:pPr>
-      <w:r>
-        <w:rPr>
-          <w:rFonts w:ascii="Times New Roman" w:hAnsi="Times New Roman"/>
-          <w:i/>
-          <w:sz w:val="28"/>
-        </w:rPr>
-        <w:t>W(s) = (Y(s)) / (U(s)) = (b_m s^m + ... + b_0) / (a_n s^n + a_(n-1) s^(n-1) + ... + a_0)</w:t>
-      </w:r>
-      <w:r>
-        <w:rPr>
-          <w:rFonts w:ascii="Times New Roman" w:hAnsi="Times New Roman"/>
-          <w:sz w:val="28"/>
-        </w:rPr>
-        <w:tab/>
-        <w:t>(59)</w:t>
-      </w:r>
-    </w:p>
-    <w:p>
-      <w:pPr/>
-      <w:r>
-        <w:t>Эта дробно-рациональная функция $W(s)$ называется **передаточной функцией** звена (или системы). Передаточная функция является исчерпывающей математической характеристикой динамических свойств линейной системы при нулевых начальных условиях. Она зависит только от внутренних параметров системы (коэффициентов $a_i$, $b_j$) и не зависит от вида входного воздействия.</w:t>
-      </w:r>
-    </w:p>
-    <w:p>
-      <w:pPr/>
-      <w:r>
-        <w:t>Многочлен в знаменателе $D(s) = a_n s^n + ... + a_0$ называется характеристическим полиномом. Уравнение $D(s) = 0$ — это характеристическое уравнение системы. Корни этого уравнения называются **полюсами** передаточной функции. Многочлен в числителе $M(s) = b_m s^m + ... + b_0$ определяет **нули** передаточной функции. Полюса и нули полностью определяют характер переходных процессов в САУ.</w:t>
-      </w:r>
-    </w:p>
-    <w:p>
-      <w:pPr>
-        <w:pStyle w:val="Heading2"/>
-      </w:pPr>
-      <w:r>
-        <w:t>3. Структурные схемы систем автоматического управления</w:t>
-      </w:r>
-    </w:p>
-    <w:p>
-      <w:pPr/>
-      <w:r>
-        <w:t>Реальные электроэнергетические системы (например, система возбуждения синхронного генератора) состоят из множества элементов: измерительных трансформаторов, выпрямителей, усилителей, магнитных пускателей и т.д. В ТАУ для визуализации математических моделей используются структурные схемы.</w:t>
-      </w:r>
-    </w:p>
-    <w:p>
-      <w:pPr/>
-      <w:r>
-        <w:t>Структурная схема — это графическое изображение математической модели системы, в котором каждому элементу ставится в соответствие прямоугольник с вписанной в него передаточной функцией $W_i(s)$. Линии со стрелками показывают направление прохождения сигналов. Для алгебраического сложения сигналов используются сумматоры (кружки с разделенными секторами).</w:t>
-      </w:r>
-    </w:p>
-    <w:p>
-      <w:pPr/>
-      <w:r>
-        <w:t>Существуют три базовых типа соединения звеньев в структурных схемах:</w:t>
-      </w:r>
-    </w:p>
-    <w:p>
-      <w:pPr>
-        <w:pStyle w:val="Heading3"/>
-      </w:pPr>
-      <w:r>
-        <w:t>3,1. Последовательное соединение</w:t>
-      </w:r>
-    </w:p>
-    <w:p>
-      <w:pPr/>
-      <w:r>
-        <w:t>Выходной сигнал предыдущего звена является входным сигналом для последующего. Передаточная функция эквивалентного звена равна произведению передаточных функций последовательно соединенных звеньев:</w:t>
-      </w:r>
-    </w:p>
-    <w:p>
-      <w:pPr>
-        <w:spacing w:before="120" w:after="120"/>
-        <w:jc w:val="center"/>
-      </w:pPr>
-      <w:r>
-        <w:rPr>
-          <w:rFonts w:ascii="Times New Roman" w:hAnsi="Times New Roman"/>
-          <w:i/>
-          <w:sz w:val="28"/>
-        </w:rPr>
-        <w:t>W_(экв)(s) = W_1(s) · W_2(s) · ... · W_k(s) = prod_(i=1)^k W_i(s)</w:t>
-      </w:r>
-      <w:r>
-        <w:rPr>
-          <w:rFonts w:ascii="Times New Roman" w:hAnsi="Times New Roman"/>
-          <w:sz w:val="28"/>
-        </w:rPr>
-        <w:tab/>
-        <w:t>(60)</w:t>
-      </w:r>
-    </w:p>
-    <w:p>
-      <w:pPr>
-        <w:pStyle w:val="Heading3"/>
-      </w:pPr>
-      <w:r>
-        <w:t>3,2. Параллельное (согласное) соединение</w:t>
-      </w:r>
-    </w:p>
-    <w:p>
-      <w:pPr/>
-      <w:r>
-        <w:t>Один и тот же входной сигнал подается на входы нескольких звеньев, а их выходные сигналы алгебраически суммируются. Эквивалентная передаточная функция равна сумме передаточных функций этих звеньев:</w:t>
-      </w:r>
-    </w:p>
-    <w:p>
-      <w:pPr>
-        <w:spacing w:before="120" w:after="120"/>
-        <w:jc w:val="center"/>
-      </w:pPr>
-      <w:r>
-        <w:rPr>
-          <w:rFonts w:ascii="Times New Roman" w:hAnsi="Times New Roman"/>
-          <w:i/>
-          <w:sz w:val="28"/>
-        </w:rPr>
-        <w:t>W_(экв)(s) = W_1(s) + W_2(s) + ... + W_k(s) = sum_(i=1)^k W_i(s)</w:t>
-      </w:r>
-      <w:r>
-        <w:rPr>
-          <w:rFonts w:ascii="Times New Roman" w:hAnsi="Times New Roman"/>
-          <w:sz w:val="28"/>
-        </w:rPr>
-        <w:tab/>
-        <w:t>(61)</w:t>
-      </w:r>
-    </w:p>
-    <w:p>
-      <w:pPr>
-        <w:pStyle w:val="Heading3"/>
-      </w:pPr>
-      <w:r>
-        <w:t>3,3. Соединение с обратной связью (встречно-параллельное)</w:t>
-      </w:r>
-    </w:p>
-    <w:p>
-      <w:pPr/>
-      <w:r>
-        <w:t>Это фундаментальное соединение для построения замкнутых САУ. Выходной сигнал основного звена $W_1(s)$ через звено обратной связи $W_2(s)$ подается обратно на вход сумматора. * Если сигнал обратной связи вычитается из задающего воздействия, связь называется **отрицательной**. Это основа для построения устойчивых регуляторов (стабилизирующих систем). * Если сигнал прибавляется — связь называется **положительной**.</w:t>
-      </w:r>
-    </w:p>
-    <w:p>
-      <w:pPr/>
-      <w:r>
-        <w:t>Эквивалентная передаточная функция замкнутого контура определяется выражением (знак "+" в знаменателе соответствует отрицательной обратной связи, знак "-" — положительной):</w:t>
-      </w:r>
-    </w:p>
-    <w:p>
-      <w:pPr>
-        <w:spacing w:before="120" w:after="120"/>
-        <w:jc w:val="center"/>
-      </w:pPr>
-      <w:r>
-        <w:rPr>
-          <w:rFonts w:ascii="Times New Roman" w:hAnsi="Times New Roman"/>
-          <w:i/>
-          <w:sz w:val="28"/>
-        </w:rPr>
-        <w:t>W_(экв)(s) = (W_1(s)) / (1 ± W_1(s) W_2(s))</w:t>
-      </w:r>
-      <w:r>
-        <w:rPr>
-          <w:rFonts w:ascii="Times New Roman" w:hAnsi="Times New Roman"/>
-          <w:sz w:val="28"/>
-        </w:rPr>
-        <w:tab/>
-        <w:t>(62)</w:t>
+        <w:t>(12)</w:t>
       </w:r>
     </w:p>
     <w:p>
@@ -2712,7 +816,7 @@
           <w:sz w:val="28"/>
         </w:rPr>
         <w:tab/>
-        <w:t>(63)</w:t>
+        <w:t>(13)</w:t>
       </w:r>
     </w:p>
     <w:p>
@@ -2754,7 +858,7 @@
           <w:sz w:val="28"/>
         </w:rPr>
         <w:tab/>
-        <w:t>(64)</w:t>
+        <w:t>(14)</w:t>
       </w:r>
     </w:p>
     <w:p>
@@ -2788,7 +892,7 @@
           <w:sz w:val="28"/>
         </w:rPr>
         <w:tab/>
-        <w:t>(65)</w:t>
+        <w:t>(15)</w:t>
       </w:r>
     </w:p>
     <w:p>
@@ -2856,7 +960,7 @@
           <w:sz w:val="28"/>
         </w:rPr>
         <w:tab/>
-        <w:t>(66)</w:t>
+        <w:t>(16)</w:t>
       </w:r>
     </w:p>
     <w:p>
@@ -2896,7 +1000,7 @@
           <w:sz w:val="28"/>
         </w:rPr>
         <w:tab/>
-        <w:t>(67)</w:t>
+        <w:t>(17)</w:t>
       </w:r>
     </w:p>
     <w:p>
@@ -2938,7 +1042,7 @@
           <w:sz w:val="28"/>
         </w:rPr>
         <w:tab/>
-        <w:t>(68)</w:t>
+        <w:t>(18)</w:t>
       </w:r>
     </w:p>
     <w:p>
@@ -2966,7 +1070,7 @@
           <w:sz w:val="28"/>
         </w:rPr>
         <w:tab/>
-        <w:t>(69)</w:t>
+        <w:t>(19)</w:t>
       </w:r>
     </w:p>
     <w:p>
@@ -2988,7 +1092,7 @@
           <w:sz w:val="28"/>
         </w:rPr>
         <w:tab/>
-        <w:t>(70)</w:t>
+        <w:t>(20)</w:t>
       </w:r>
     </w:p>
     <w:p>
@@ -3030,7 +1134,7 @@
           <w:sz w:val="28"/>
         </w:rPr>
         <w:tab/>
-        <w:t>(71)</w:t>
+        <w:t>(21)</w:t>
       </w:r>
     </w:p>
     <w:p>
@@ -3058,7 +1162,7 @@
           <w:sz w:val="28"/>
         </w:rPr>
         <w:tab/>
-        <w:t>(72)</w:t>
+        <w:t>(22)</w:t>
       </w:r>
     </w:p>
     <w:p>
@@ -3080,7 +1184,7 @@
           <w:sz w:val="28"/>
         </w:rPr>
         <w:tab/>
-        <w:t>(73)</w:t>
+        <w:t>(23)</w:t>
       </w:r>
     </w:p>
     <w:p>
@@ -3122,7 +1226,7 @@
           <w:sz w:val="28"/>
         </w:rPr>
         <w:tab/>
-        <w:t>(74)</w:t>
+        <w:t>(24)</w:t>
       </w:r>
     </w:p>
     <w:p>
@@ -3156,7 +1260,7 @@
           <w:sz w:val="28"/>
         </w:rPr>
         <w:tab/>
-        <w:t>(75)</w:t>
+        <w:t>(25)</w:t>
       </w:r>
     </w:p>
     <w:p>
@@ -3184,7 +1288,7 @@
           <w:sz w:val="28"/>
         </w:rPr>
         <w:tab/>
-        <w:t>(76)</w:t>
+        <w:t>(26)</w:t>
       </w:r>
     </w:p>
     <w:p>
@@ -3232,7 +1336,7 @@
           <w:sz w:val="28"/>
         </w:rPr>
         <w:tab/>
-        <w:t>(77)</w:t>
+        <w:t>(27)</w:t>
       </w:r>
     </w:p>
     <w:p>
@@ -3266,7 +1370,7 @@
           <w:sz w:val="28"/>
         </w:rPr>
         <w:tab/>
-        <w:t>(78)</w:t>
+        <w:t>(28)</w:t>
       </w:r>
     </w:p>
     <w:p>
@@ -3293,24 +1397,6 @@
       <w:pStyle w:val="Footer"/>
       <w:jc w:val="center"/>
     </w:pPr>
-    <w:r>
-      <w:rPr>
-        <w:rFonts w:ascii="Times New Roman" w:hAnsi="Times New Roman"/>
-        <w:sz w:val="28"/>
-      </w:rPr>
-      <w:fldChar w:fldCharType="begin"/>
-      <w:instrText xml:space="preserve"> PAGE </w:instrText>
-      <w:fldChar w:fldCharType="end"/>
-    </w:r>
-    <w:r>
-      <w:rPr>
-        <w:rFonts w:ascii="Times New Roman" w:hAnsi="Times New Roman"/>
-        <w:sz w:val="28"/>
-      </w:rPr>
-      <w:fldChar w:fldCharType="begin"/>
-      <w:instrText xml:space="preserve"> PAGE </w:instrText>
-      <w:fldChar w:fldCharType="end"/>
-    </w:r>
     <w:r>
       <w:rPr>
         <w:rFonts w:ascii="Times New Roman" w:hAnsi="Times New Roman"/>

</xml_diff>